<commit_message>
docs: inclui URL de produção (Vercel) no Documento de Especificação v1.7
Co-Authored-By: Claude Opus 5.5 <noreply@anthropic.com>
Claude-Session: https://claude.ai/code/session_01DVmQzYeLBgR7DThUVFVQh5
</commit_message>
<xml_diff>
--- a/Documento_de_Especificacao_Prontuario-Pro.docx
+++ b/Documento_de_Especificacao_Prontuario-Pro.docx
@@ -14,7 +14,7 @@
           <w:noProof/>
         </w:rPr>
         <w:drawing>
-          <wp:inline distT="0" distB="0" distL="0" distR="0" wp14:anchorId="36A39328" wp14:editId="3C5131BC">
+          <wp:inline distT="0" distB="0" distL="0" distR="0" wp14:anchorId="0A464DF3" wp14:editId="46290E36">
             <wp:extent cx="5760000" cy="2286578"/>
             <wp:effectExtent l="0" t="0" r="0" b="0"/>
             <wp:docPr id="1" name="Picture 1"/>
@@ -131,7 +131,7 @@
       <w:r>
         <w:fldChar w:fldCharType="separate"/>
       </w:r>
-      <w:hyperlink w:anchor="_Toc243227936" w:history="1">
+      <w:hyperlink w:anchor="_Toc243238299" w:history="1">
         <w:r>
           <w:rPr>
             <w:rStyle w:val="Hyperlink"/>
@@ -158,7 +158,7 @@
             <w:noProof/>
             <w:webHidden/>
           </w:rPr>
-          <w:instrText xml:space="preserve"> PAGEREF _Toc243227936 \h </w:instrText>
+          <w:instrText xml:space="preserve"> PAGEREF _Toc243238299 \h </w:instrText>
         </w:r>
         <w:r>
           <w:rPr>
@@ -199,7 +199,7 @@
           <w:noProof/>
         </w:rPr>
       </w:pPr>
-      <w:hyperlink w:anchor="_Toc243227937" w:history="1">
+      <w:hyperlink w:anchor="_Toc243238300" w:history="1">
         <w:r>
           <w:rPr>
             <w:rStyle w:val="Hyperlink"/>
@@ -226,7 +226,7 @@
             <w:noProof/>
             <w:webHidden/>
           </w:rPr>
-          <w:instrText xml:space="preserve"> PAGEREF _Toc243227937 \h </w:instrText>
+          <w:instrText xml:space="preserve"> PAGEREF _Toc243238300 \h </w:instrText>
         </w:r>
         <w:r>
           <w:rPr>
@@ -267,7 +267,7 @@
           <w:noProof/>
         </w:rPr>
       </w:pPr>
-      <w:hyperlink w:anchor="_Toc243227938" w:history="1">
+      <w:hyperlink w:anchor="_Toc243238301" w:history="1">
         <w:r>
           <w:rPr>
             <w:rStyle w:val="Hyperlink"/>
@@ -294,7 +294,7 @@
             <w:noProof/>
             <w:webHidden/>
           </w:rPr>
-          <w:instrText xml:space="preserve"> PAGEREF _Toc243227938 \h </w:instrText>
+          <w:instrText xml:space="preserve"> PAGEREF _Toc243238301 \h </w:instrText>
         </w:r>
         <w:r>
           <w:rPr>
@@ -335,7 +335,7 @@
           <w:noProof/>
         </w:rPr>
       </w:pPr>
-      <w:hyperlink w:anchor="_Toc243227939" w:history="1">
+      <w:hyperlink w:anchor="_Toc243238302" w:history="1">
         <w:r>
           <w:rPr>
             <w:rStyle w:val="Hyperlink"/>
@@ -362,7 +362,7 @@
             <w:noProof/>
             <w:webHidden/>
           </w:rPr>
-          <w:instrText xml:space="preserve"> PAGEREF _Toc243227939 \h </w:instrText>
+          <w:instrText xml:space="preserve"> PAGEREF _Toc243238302 \h </w:instrText>
         </w:r>
         <w:r>
           <w:rPr>
@@ -403,7 +403,7 @@
           <w:noProof/>
         </w:rPr>
       </w:pPr>
-      <w:hyperlink w:anchor="_Toc243227940" w:history="1">
+      <w:hyperlink w:anchor="_Toc243238303" w:history="1">
         <w:r>
           <w:rPr>
             <w:rStyle w:val="Hyperlink"/>
@@ -430,7 +430,7 @@
             <w:noProof/>
             <w:webHidden/>
           </w:rPr>
-          <w:instrText xml:space="preserve"> PAGEREF _Toc243227940 \h </w:instrText>
+          <w:instrText xml:space="preserve"> PAGEREF _Toc243238303 \h </w:instrText>
         </w:r>
         <w:r>
           <w:rPr>
@@ -471,7 +471,7 @@
           <w:noProof/>
         </w:rPr>
       </w:pPr>
-      <w:hyperlink w:anchor="_Toc243227941" w:history="1">
+      <w:hyperlink w:anchor="_Toc243238304" w:history="1">
         <w:r>
           <w:rPr>
             <w:rStyle w:val="Hyperlink"/>
@@ -498,7 +498,7 @@
             <w:noProof/>
             <w:webHidden/>
           </w:rPr>
-          <w:instrText xml:space="preserve"> PAGEREF _Toc243227941 \h </w:instrText>
+          <w:instrText xml:space="preserve"> PAGEREF _Toc243238304 \h </w:instrText>
         </w:r>
         <w:r>
           <w:rPr>
@@ -539,7 +539,7 @@
           <w:noProof/>
         </w:rPr>
       </w:pPr>
-      <w:hyperlink w:anchor="_Toc243227942" w:history="1">
+      <w:hyperlink w:anchor="_Toc243238305" w:history="1">
         <w:r>
           <w:rPr>
             <w:rStyle w:val="Hyperlink"/>
@@ -566,7 +566,7 @@
             <w:noProof/>
             <w:webHidden/>
           </w:rPr>
-          <w:instrText xml:space="preserve"> PAGEREF _Toc243227942 \h </w:instrText>
+          <w:instrText xml:space="preserve"> PAGEREF _Toc243238305 \h </w:instrText>
         </w:r>
         <w:r>
           <w:rPr>
@@ -607,7 +607,7 @@
           <w:noProof/>
         </w:rPr>
       </w:pPr>
-      <w:hyperlink w:anchor="_Toc243227943" w:history="1">
+      <w:hyperlink w:anchor="_Toc243238306" w:history="1">
         <w:r>
           <w:rPr>
             <w:rStyle w:val="Hyperlink"/>
@@ -634,7 +634,7 @@
             <w:noProof/>
             <w:webHidden/>
           </w:rPr>
-          <w:instrText xml:space="preserve"> PAGEREF _Toc243227943 \h </w:instrText>
+          <w:instrText xml:space="preserve"> PAGEREF _Toc243238306 \h </w:instrText>
         </w:r>
         <w:r>
           <w:rPr>
@@ -675,7 +675,7 @@
           <w:noProof/>
         </w:rPr>
       </w:pPr>
-      <w:hyperlink w:anchor="_Toc243227944" w:history="1">
+      <w:hyperlink w:anchor="_Toc243238307" w:history="1">
         <w:r>
           <w:rPr>
             <w:rStyle w:val="Hyperlink"/>
@@ -702,7 +702,7 @@
             <w:noProof/>
             <w:webHidden/>
           </w:rPr>
-          <w:instrText xml:space="preserve"> PAGEREF _Toc243227944 \h </w:instrText>
+          <w:instrText xml:space="preserve"> PAGEREF _Toc243238307 \h </w:instrText>
         </w:r>
         <w:r>
           <w:rPr>
@@ -743,7 +743,7 @@
           <w:noProof/>
         </w:rPr>
       </w:pPr>
-      <w:hyperlink w:anchor="_Toc243227945" w:history="1">
+      <w:hyperlink w:anchor="_Toc243238308" w:history="1">
         <w:r>
           <w:rPr>
             <w:rStyle w:val="Hyperlink"/>
@@ -770,7 +770,7 @@
             <w:noProof/>
             <w:webHidden/>
           </w:rPr>
-          <w:instrText xml:space="preserve"> PAGEREF _Toc243227945 \h </w:instrText>
+          <w:instrText xml:space="preserve"> PAGEREF _Toc243238308 \h </w:instrText>
         </w:r>
         <w:r>
           <w:rPr>
@@ -811,7 +811,7 @@
           <w:noProof/>
         </w:rPr>
       </w:pPr>
-      <w:hyperlink w:anchor="_Toc243227946" w:history="1">
+      <w:hyperlink w:anchor="_Toc243238309" w:history="1">
         <w:r>
           <w:rPr>
             <w:rStyle w:val="Hyperlink"/>
@@ -838,7 +838,7 @@
             <w:noProof/>
             <w:webHidden/>
           </w:rPr>
-          <w:instrText xml:space="preserve"> PAGEREF _Toc243227946 \h </w:instrText>
+          <w:instrText xml:space="preserve"> PAGEREF _Toc243238309 \h </w:instrText>
         </w:r>
         <w:r>
           <w:rPr>
@@ -879,7 +879,7 @@
           <w:noProof/>
         </w:rPr>
       </w:pPr>
-      <w:hyperlink w:anchor="_Toc243227947" w:history="1">
+      <w:hyperlink w:anchor="_Toc243238310" w:history="1">
         <w:r>
           <w:rPr>
             <w:rStyle w:val="Hyperlink"/>
@@ -906,7 +906,7 @@
             <w:noProof/>
             <w:webHidden/>
           </w:rPr>
-          <w:instrText xml:space="preserve"> PAGEREF _Toc243227947 \h </w:instrText>
+          <w:instrText xml:space="preserve"> PAGEREF _Toc243238310 \h </w:instrText>
         </w:r>
         <w:r>
           <w:rPr>
@@ -947,7 +947,7 @@
           <w:noProof/>
         </w:rPr>
       </w:pPr>
-      <w:hyperlink w:anchor="_Toc243227948" w:history="1">
+      <w:hyperlink w:anchor="_Toc243238311" w:history="1">
         <w:r>
           <w:rPr>
             <w:rStyle w:val="Hyperlink"/>
@@ -974,7 +974,7 @@
             <w:noProof/>
             <w:webHidden/>
           </w:rPr>
-          <w:instrText xml:space="preserve"> PAGEREF _Toc243227948 \h </w:instrText>
+          <w:instrText xml:space="preserve"> PAGEREF _Toc243238311 \h </w:instrText>
         </w:r>
         <w:r>
           <w:rPr>
@@ -1015,7 +1015,7 @@
           <w:noProof/>
         </w:rPr>
       </w:pPr>
-      <w:hyperlink w:anchor="_Toc243227949" w:history="1">
+      <w:hyperlink w:anchor="_Toc243238312" w:history="1">
         <w:r>
           <w:rPr>
             <w:rStyle w:val="Hyperlink"/>
@@ -1042,7 +1042,7 @@
             <w:noProof/>
             <w:webHidden/>
           </w:rPr>
-          <w:instrText xml:space="preserve"> PAGEREF _Toc243227949 \h </w:instrText>
+          <w:instrText xml:space="preserve"> PAGEREF _Toc243238312 \h </w:instrText>
         </w:r>
         <w:r>
           <w:rPr>
@@ -1083,7 +1083,7 @@
           <w:noProof/>
         </w:rPr>
       </w:pPr>
-      <w:hyperlink w:anchor="_Toc243227950" w:history="1">
+      <w:hyperlink w:anchor="_Toc243238313" w:history="1">
         <w:r>
           <w:rPr>
             <w:rStyle w:val="Hyperlink"/>
@@ -1110,7 +1110,7 @@
             <w:noProof/>
             <w:webHidden/>
           </w:rPr>
-          <w:instrText xml:space="preserve"> PAGEREF _Toc243227950 \h </w:instrText>
+          <w:instrText xml:space="preserve"> PAGEREF _Toc243238313 \h </w:instrText>
         </w:r>
         <w:r>
           <w:rPr>
@@ -1151,7 +1151,7 @@
           <w:noProof/>
         </w:rPr>
       </w:pPr>
-      <w:hyperlink w:anchor="_Toc243227951" w:history="1">
+      <w:hyperlink w:anchor="_Toc243238314" w:history="1">
         <w:r>
           <w:rPr>
             <w:rStyle w:val="Hyperlink"/>
@@ -1178,7 +1178,7 @@
             <w:noProof/>
             <w:webHidden/>
           </w:rPr>
-          <w:instrText xml:space="preserve"> PAGEREF _Toc243227951 \h </w:instrText>
+          <w:instrText xml:space="preserve"> PAGEREF _Toc243238314 \h </w:instrText>
         </w:r>
         <w:r>
           <w:rPr>
@@ -1219,7 +1219,7 @@
           <w:noProof/>
         </w:rPr>
       </w:pPr>
-      <w:hyperlink w:anchor="_Toc243227952" w:history="1">
+      <w:hyperlink w:anchor="_Toc243238315" w:history="1">
         <w:r>
           <w:rPr>
             <w:rStyle w:val="Hyperlink"/>
@@ -1246,7 +1246,7 @@
             <w:noProof/>
             <w:webHidden/>
           </w:rPr>
-          <w:instrText xml:space="preserve"> PAGEREF _Toc243227952 \h </w:instrText>
+          <w:instrText xml:space="preserve"> PAGEREF _Toc243238315 \h </w:instrText>
         </w:r>
         <w:r>
           <w:rPr>
@@ -1287,7 +1287,7 @@
           <w:noProof/>
         </w:rPr>
       </w:pPr>
-      <w:hyperlink w:anchor="_Toc243227953" w:history="1">
+      <w:hyperlink w:anchor="_Toc243238316" w:history="1">
         <w:r>
           <w:rPr>
             <w:rStyle w:val="Hyperlink"/>
@@ -1314,7 +1314,7 @@
             <w:noProof/>
             <w:webHidden/>
           </w:rPr>
-          <w:instrText xml:space="preserve"> PAGEREF _Toc243227953 \h </w:instrText>
+          <w:instrText xml:space="preserve"> PAGEREF _Toc243238316 \h </w:instrText>
         </w:r>
         <w:r>
           <w:rPr>
@@ -1355,7 +1355,7 @@
           <w:noProof/>
         </w:rPr>
       </w:pPr>
-      <w:hyperlink w:anchor="_Toc243227954" w:history="1">
+      <w:hyperlink w:anchor="_Toc243238317" w:history="1">
         <w:r>
           <w:rPr>
             <w:rStyle w:val="Hyperlink"/>
@@ -1382,7 +1382,7 @@
             <w:noProof/>
             <w:webHidden/>
           </w:rPr>
-          <w:instrText xml:space="preserve"> PAGEREF _Toc243227954 \h </w:instrText>
+          <w:instrText xml:space="preserve"> PAGEREF _Toc243238317 \h </w:instrText>
         </w:r>
         <w:r>
           <w:rPr>
@@ -1423,7 +1423,7 @@
           <w:noProof/>
         </w:rPr>
       </w:pPr>
-      <w:hyperlink w:anchor="_Toc243227955" w:history="1">
+      <w:hyperlink w:anchor="_Toc243238318" w:history="1">
         <w:r>
           <w:rPr>
             <w:rStyle w:val="Hyperlink"/>
@@ -1450,7 +1450,7 @@
             <w:noProof/>
             <w:webHidden/>
           </w:rPr>
-          <w:instrText xml:space="preserve"> PAGEREF _Toc243227955 \h </w:instrText>
+          <w:instrText xml:space="preserve"> PAGEREF _Toc243238318 \h </w:instrText>
         </w:r>
         <w:r>
           <w:rPr>
@@ -1491,7 +1491,7 @@
           <w:noProof/>
         </w:rPr>
       </w:pPr>
-      <w:hyperlink w:anchor="_Toc243227956" w:history="1">
+      <w:hyperlink w:anchor="_Toc243238319" w:history="1">
         <w:r>
           <w:rPr>
             <w:rStyle w:val="Hyperlink"/>
@@ -1518,7 +1518,7 @@
             <w:noProof/>
             <w:webHidden/>
           </w:rPr>
-          <w:instrText xml:space="preserve"> PAGEREF _Toc243227956 \h </w:instrText>
+          <w:instrText xml:space="preserve"> PAGEREF _Toc243238319 \h </w:instrText>
         </w:r>
         <w:r>
           <w:rPr>
@@ -1559,7 +1559,7 @@
           <w:noProof/>
         </w:rPr>
       </w:pPr>
-      <w:hyperlink w:anchor="_Toc243227957" w:history="1">
+      <w:hyperlink w:anchor="_Toc243238320" w:history="1">
         <w:r>
           <w:rPr>
             <w:rStyle w:val="Hyperlink"/>
@@ -1586,7 +1586,7 @@
             <w:noProof/>
             <w:webHidden/>
           </w:rPr>
-          <w:instrText xml:space="preserve"> PAGEREF _Toc243227957 \h </w:instrText>
+          <w:instrText xml:space="preserve"> PAGEREF _Toc243238320 \h </w:instrText>
         </w:r>
         <w:r>
           <w:rPr>
@@ -1627,7 +1627,7 @@
           <w:noProof/>
         </w:rPr>
       </w:pPr>
-      <w:hyperlink w:anchor="_Toc243227958" w:history="1">
+      <w:hyperlink w:anchor="_Toc243238321" w:history="1">
         <w:r>
           <w:rPr>
             <w:rStyle w:val="Hyperlink"/>
@@ -1654,7 +1654,7 @@
             <w:noProof/>
             <w:webHidden/>
           </w:rPr>
-          <w:instrText xml:space="preserve"> PAGEREF _Toc243227958 \h </w:instrText>
+          <w:instrText xml:space="preserve"> PAGEREF _Toc243238321 \h </w:instrText>
         </w:r>
         <w:r>
           <w:rPr>
@@ -1695,7 +1695,7 @@
           <w:noProof/>
         </w:rPr>
       </w:pPr>
-      <w:hyperlink w:anchor="_Toc243227959" w:history="1">
+      <w:hyperlink w:anchor="_Toc243238322" w:history="1">
         <w:r>
           <w:rPr>
             <w:rStyle w:val="Hyperlink"/>
@@ -1722,7 +1722,7 @@
             <w:noProof/>
             <w:webHidden/>
           </w:rPr>
-          <w:instrText xml:space="preserve"> PAGEREF _Toc243227959 \h </w:instrText>
+          <w:instrText xml:space="preserve"> PAGEREF _Toc243238322 \h </w:instrText>
         </w:r>
         <w:r>
           <w:rPr>
@@ -1763,7 +1763,7 @@
           <w:noProof/>
         </w:rPr>
       </w:pPr>
-      <w:hyperlink w:anchor="_Toc243227960" w:history="1">
+      <w:hyperlink w:anchor="_Toc243238323" w:history="1">
         <w:r>
           <w:rPr>
             <w:rStyle w:val="Hyperlink"/>
@@ -1790,7 +1790,7 @@
             <w:noProof/>
             <w:webHidden/>
           </w:rPr>
-          <w:instrText xml:space="preserve"> PAGEREF _Toc243227960 \h </w:instrText>
+          <w:instrText xml:space="preserve"> PAGEREF _Toc243238323 \h </w:instrText>
         </w:r>
         <w:r>
           <w:rPr>
@@ -1831,7 +1831,7 @@
           <w:noProof/>
         </w:rPr>
       </w:pPr>
-      <w:hyperlink w:anchor="_Toc243227961" w:history="1">
+      <w:hyperlink w:anchor="_Toc243238324" w:history="1">
         <w:r>
           <w:rPr>
             <w:rStyle w:val="Hyperlink"/>
@@ -1858,7 +1858,7 @@
             <w:noProof/>
             <w:webHidden/>
           </w:rPr>
-          <w:instrText xml:space="preserve"> PAGEREF _Toc243227961 \h </w:instrText>
+          <w:instrText xml:space="preserve"> PAGEREF _Toc243238324 \h </w:instrText>
         </w:r>
         <w:r>
           <w:rPr>
@@ -1899,7 +1899,7 @@
           <w:noProof/>
         </w:rPr>
       </w:pPr>
-      <w:hyperlink w:anchor="_Toc243227962" w:history="1">
+      <w:hyperlink w:anchor="_Toc243238325" w:history="1">
         <w:r>
           <w:rPr>
             <w:rStyle w:val="Hyperlink"/>
@@ -1926,7 +1926,7 @@
             <w:noProof/>
             <w:webHidden/>
           </w:rPr>
-          <w:instrText xml:space="preserve"> PAGEREF _Toc243227962 \h </w:instrText>
+          <w:instrText xml:space="preserve"> PAGEREF _Toc243238325 \h </w:instrText>
         </w:r>
         <w:r>
           <w:rPr>
@@ -1967,7 +1967,7 @@
           <w:noProof/>
         </w:rPr>
       </w:pPr>
-      <w:hyperlink w:anchor="_Toc243227963" w:history="1">
+      <w:hyperlink w:anchor="_Toc243238326" w:history="1">
         <w:r>
           <w:rPr>
             <w:rStyle w:val="Hyperlink"/>
@@ -1994,7 +1994,7 @@
             <w:noProof/>
             <w:webHidden/>
           </w:rPr>
-          <w:instrText xml:space="preserve"> PAGEREF _Toc243227963 \h </w:instrText>
+          <w:instrText xml:space="preserve"> PAGEREF _Toc243238326 \h </w:instrText>
         </w:r>
         <w:r>
           <w:rPr>
@@ -2035,7 +2035,7 @@
           <w:noProof/>
         </w:rPr>
       </w:pPr>
-      <w:hyperlink w:anchor="_Toc243227964" w:history="1">
+      <w:hyperlink w:anchor="_Toc243238327" w:history="1">
         <w:r>
           <w:rPr>
             <w:rStyle w:val="Hyperlink"/>
@@ -2062,7 +2062,7 @@
             <w:noProof/>
             <w:webHidden/>
           </w:rPr>
-          <w:instrText xml:space="preserve"> PAGEREF _Toc243227964 \h </w:instrText>
+          <w:instrText xml:space="preserve"> PAGEREF _Toc243238327 \h </w:instrText>
         </w:r>
         <w:r>
           <w:rPr>
@@ -2103,7 +2103,7 @@
           <w:noProof/>
         </w:rPr>
       </w:pPr>
-      <w:hyperlink w:anchor="_Toc243227965" w:history="1">
+      <w:hyperlink w:anchor="_Toc243238328" w:history="1">
         <w:r>
           <w:rPr>
             <w:rStyle w:val="Hyperlink"/>
@@ -2130,7 +2130,7 @@
             <w:noProof/>
             <w:webHidden/>
           </w:rPr>
-          <w:instrText xml:space="preserve"> PAGEREF _Toc243227965 \h </w:instrText>
+          <w:instrText xml:space="preserve"> PAGEREF _Toc243238328 \h </w:instrText>
         </w:r>
         <w:r>
           <w:rPr>
@@ -2171,7 +2171,7 @@
           <w:noProof/>
         </w:rPr>
       </w:pPr>
-      <w:hyperlink w:anchor="_Toc243227966" w:history="1">
+      <w:hyperlink w:anchor="_Toc243238329" w:history="1">
         <w:r>
           <w:rPr>
             <w:rStyle w:val="Hyperlink"/>
@@ -2198,7 +2198,7 @@
             <w:noProof/>
             <w:webHidden/>
           </w:rPr>
-          <w:instrText xml:space="preserve"> PAGEREF _Toc243227966 \h </w:instrText>
+          <w:instrText xml:space="preserve"> PAGEREF _Toc243238329 \h </w:instrText>
         </w:r>
         <w:r>
           <w:rPr>
@@ -2239,7 +2239,7 @@
           <w:noProof/>
         </w:rPr>
       </w:pPr>
-      <w:hyperlink w:anchor="_Toc243227967" w:history="1">
+      <w:hyperlink w:anchor="_Toc243238330" w:history="1">
         <w:r>
           <w:rPr>
             <w:rStyle w:val="Hyperlink"/>
@@ -2266,7 +2266,7 @@
             <w:noProof/>
             <w:webHidden/>
           </w:rPr>
-          <w:instrText xml:space="preserve"> PAGEREF _Toc243227967 \h </w:instrText>
+          <w:instrText xml:space="preserve"> PAGEREF _Toc243238330 \h </w:instrText>
         </w:r>
         <w:r>
           <w:rPr>
@@ -2307,7 +2307,7 @@
           <w:noProof/>
         </w:rPr>
       </w:pPr>
-      <w:hyperlink w:anchor="_Toc243227968" w:history="1">
+      <w:hyperlink w:anchor="_Toc243238331" w:history="1">
         <w:r>
           <w:rPr>
             <w:rStyle w:val="Hyperlink"/>
@@ -2334,7 +2334,7 @@
             <w:noProof/>
             <w:webHidden/>
           </w:rPr>
-          <w:instrText xml:space="preserve"> PAGEREF _Toc243227968 \h </w:instrText>
+          <w:instrText xml:space="preserve"> PAGEREF _Toc243238331 \h </w:instrText>
         </w:r>
         <w:r>
           <w:rPr>
@@ -2375,7 +2375,7 @@
           <w:noProof/>
         </w:rPr>
       </w:pPr>
-      <w:hyperlink w:anchor="_Toc243227969" w:history="1">
+      <w:hyperlink w:anchor="_Toc243238332" w:history="1">
         <w:r>
           <w:rPr>
             <w:rStyle w:val="Hyperlink"/>
@@ -2402,7 +2402,7 @@
             <w:noProof/>
             <w:webHidden/>
           </w:rPr>
-          <w:instrText xml:space="preserve"> PAGEREF _Toc243227969 \h </w:instrText>
+          <w:instrText xml:space="preserve"> PAGEREF _Toc243238332 \h </w:instrText>
         </w:r>
         <w:r>
           <w:rPr>
@@ -2443,7 +2443,7 @@
           <w:noProof/>
         </w:rPr>
       </w:pPr>
-      <w:hyperlink w:anchor="_Toc243227970" w:history="1">
+      <w:hyperlink w:anchor="_Toc243238333" w:history="1">
         <w:r>
           <w:rPr>
             <w:rStyle w:val="Hyperlink"/>
@@ -2470,7 +2470,7 @@
             <w:noProof/>
             <w:webHidden/>
           </w:rPr>
-          <w:instrText xml:space="preserve"> PAGEREF _Toc243227970 \h </w:instrText>
+          <w:instrText xml:space="preserve"> PAGEREF _Toc243238333 \h </w:instrText>
         </w:r>
         <w:r>
           <w:rPr>
@@ -2511,7 +2511,7 @@
           <w:noProof/>
         </w:rPr>
       </w:pPr>
-      <w:hyperlink w:anchor="_Toc243227971" w:history="1">
+      <w:hyperlink w:anchor="_Toc243238334" w:history="1">
         <w:r>
           <w:rPr>
             <w:rStyle w:val="Hyperlink"/>
@@ -2538,7 +2538,7 @@
             <w:noProof/>
             <w:webHidden/>
           </w:rPr>
-          <w:instrText xml:space="preserve"> PAGEREF _Toc243227971 \h </w:instrText>
+          <w:instrText xml:space="preserve"> PAGEREF _Toc243238334 \h </w:instrText>
         </w:r>
         <w:r>
           <w:rPr>
@@ -2579,7 +2579,7 @@
           <w:noProof/>
         </w:rPr>
       </w:pPr>
-      <w:hyperlink w:anchor="_Toc243227972" w:history="1">
+      <w:hyperlink w:anchor="_Toc243238335" w:history="1">
         <w:r>
           <w:rPr>
             <w:rStyle w:val="Hyperlink"/>
@@ -2606,7 +2606,7 @@
             <w:noProof/>
             <w:webHidden/>
           </w:rPr>
-          <w:instrText xml:space="preserve"> PAGEREF _Toc243227972 \h </w:instrText>
+          <w:instrText xml:space="preserve"> PAGEREF _Toc243238335 \h </w:instrText>
         </w:r>
         <w:r>
           <w:rPr>
@@ -2647,7 +2647,7 @@
           <w:noProof/>
         </w:rPr>
       </w:pPr>
-      <w:hyperlink w:anchor="_Toc243227973" w:history="1">
+      <w:hyperlink w:anchor="_Toc243238336" w:history="1">
         <w:r>
           <w:rPr>
             <w:rStyle w:val="Hyperlink"/>
@@ -2674,7 +2674,7 @@
             <w:noProof/>
             <w:webHidden/>
           </w:rPr>
-          <w:instrText xml:space="preserve"> PAGEREF _Toc243227973 \h </w:instrText>
+          <w:instrText xml:space="preserve"> PAGEREF _Toc243238336 \h </w:instrText>
         </w:r>
         <w:r>
           <w:rPr>
@@ -2715,7 +2715,7 @@
           <w:noProof/>
         </w:rPr>
       </w:pPr>
-      <w:hyperlink w:anchor="_Toc243227974" w:history="1">
+      <w:hyperlink w:anchor="_Toc243238337" w:history="1">
         <w:r>
           <w:rPr>
             <w:rStyle w:val="Hyperlink"/>
@@ -2742,75 +2742,7 @@
             <w:noProof/>
             <w:webHidden/>
           </w:rPr>
-          <w:instrText xml:space="preserve"> PAGEREF _Toc243227974 \h </w:instrText>
-        </w:r>
-        <w:r>
-          <w:rPr>
-            <w:noProof/>
-            <w:webHidden/>
-          </w:rPr>
-        </w:r>
-        <w:r>
-          <w:rPr>
-            <w:noProof/>
-            <w:webHidden/>
-          </w:rPr>
-          <w:fldChar w:fldCharType="separate"/>
-        </w:r>
-        <w:r>
-          <w:rPr>
-            <w:noProof/>
-            <w:webHidden/>
-          </w:rPr>
-          <w:t>26</w:t>
-        </w:r>
-        <w:r>
-          <w:rPr>
-            <w:noProof/>
-            <w:webHidden/>
-          </w:rPr>
-          <w:fldChar w:fldCharType="end"/>
-        </w:r>
-      </w:hyperlink>
-    </w:p>
-    <w:p>
-      <w:pPr>
-        <w:pStyle w:val="Sumrio3"/>
-        <w:tabs>
-          <w:tab w:val="right" w:leader="dot" w:pos="9628"/>
-        </w:tabs>
-        <w:rPr>
-          <w:noProof/>
-        </w:rPr>
-      </w:pPr>
-      <w:hyperlink w:anchor="_Toc243227975" w:history="1">
-        <w:r>
-          <w:rPr>
-            <w:rStyle w:val="Hyperlink"/>
-            <w:noProof/>
-          </w:rPr>
-          <w:t>22.1 Frontend</w:t>
-        </w:r>
-        <w:r>
-          <w:rPr>
-            <w:noProof/>
-            <w:webHidden/>
-          </w:rPr>
-          <w:tab/>
-        </w:r>
-        <w:r>
-          <w:rPr>
-            <w:noProof/>
-            <w:webHidden/>
-          </w:rPr>
-          <w:fldChar w:fldCharType="begin"/>
-        </w:r>
-        <w:r>
-          <w:rPr>
-            <w:noProof/>
-            <w:webHidden/>
-          </w:rPr>
-          <w:instrText xml:space="preserve"> PAGEREF _Toc243227975 \h </w:instrText>
+          <w:instrText xml:space="preserve"> PAGEREF _Toc243238337 \h </w:instrText>
         </w:r>
         <w:r>
           <w:rPr>
@@ -2851,7 +2783,75 @@
           <w:noProof/>
         </w:rPr>
       </w:pPr>
-      <w:hyperlink w:anchor="_Toc243227976" w:history="1">
+      <w:hyperlink w:anchor="_Toc243238338" w:history="1">
+        <w:r>
+          <w:rPr>
+            <w:rStyle w:val="Hyperlink"/>
+            <w:noProof/>
+          </w:rPr>
+          <w:t>22.1 Frontend</w:t>
+        </w:r>
+        <w:r>
+          <w:rPr>
+            <w:noProof/>
+            <w:webHidden/>
+          </w:rPr>
+          <w:tab/>
+        </w:r>
+        <w:r>
+          <w:rPr>
+            <w:noProof/>
+            <w:webHidden/>
+          </w:rPr>
+          <w:fldChar w:fldCharType="begin"/>
+        </w:r>
+        <w:r>
+          <w:rPr>
+            <w:noProof/>
+            <w:webHidden/>
+          </w:rPr>
+          <w:instrText xml:space="preserve"> PAGEREF _Toc243238338 \h </w:instrText>
+        </w:r>
+        <w:r>
+          <w:rPr>
+            <w:noProof/>
+            <w:webHidden/>
+          </w:rPr>
+        </w:r>
+        <w:r>
+          <w:rPr>
+            <w:noProof/>
+            <w:webHidden/>
+          </w:rPr>
+          <w:fldChar w:fldCharType="separate"/>
+        </w:r>
+        <w:r>
+          <w:rPr>
+            <w:noProof/>
+            <w:webHidden/>
+          </w:rPr>
+          <w:t>27</w:t>
+        </w:r>
+        <w:r>
+          <w:rPr>
+            <w:noProof/>
+            <w:webHidden/>
+          </w:rPr>
+          <w:fldChar w:fldCharType="end"/>
+        </w:r>
+      </w:hyperlink>
+    </w:p>
+    <w:p>
+      <w:pPr>
+        <w:pStyle w:val="Sumrio3"/>
+        <w:tabs>
+          <w:tab w:val="right" w:leader="dot" w:pos="9628"/>
+        </w:tabs>
+        <w:rPr>
+          <w:noProof/>
+        </w:rPr>
+      </w:pPr>
+      <w:hyperlink w:anchor="_Toc243238339" w:history="1">
         <w:r>
           <w:rPr>
             <w:rStyle w:val="Hyperlink"/>
@@ -2878,7 +2878,7 @@
             <w:noProof/>
             <w:webHidden/>
           </w:rPr>
-          <w:instrText xml:space="preserve"> PAGEREF _Toc243227976 \h </w:instrText>
+          <w:instrText xml:space="preserve"> PAGEREF _Toc243238339 \h </w:instrText>
         </w:r>
         <w:r>
           <w:rPr>
@@ -2919,7 +2919,7 @@
           <w:noProof/>
         </w:rPr>
       </w:pPr>
-      <w:hyperlink w:anchor="_Toc243227977" w:history="1">
+      <w:hyperlink w:anchor="_Toc243238340" w:history="1">
         <w:r>
           <w:rPr>
             <w:rStyle w:val="Hyperlink"/>
@@ -2946,7 +2946,7 @@
             <w:noProof/>
             <w:webHidden/>
           </w:rPr>
-          <w:instrText xml:space="preserve"> PAGEREF _Toc243227977 \h </w:instrText>
+          <w:instrText xml:space="preserve"> PAGEREF _Toc243238340 \h </w:instrText>
         </w:r>
         <w:r>
           <w:rPr>
@@ -2987,7 +2987,7 @@
           <w:noProof/>
         </w:rPr>
       </w:pPr>
-      <w:hyperlink w:anchor="_Toc243227978" w:history="1">
+      <w:hyperlink w:anchor="_Toc243238341" w:history="1">
         <w:r>
           <w:rPr>
             <w:rStyle w:val="Hyperlink"/>
@@ -3014,7 +3014,7 @@
             <w:noProof/>
             <w:webHidden/>
           </w:rPr>
-          <w:instrText xml:space="preserve"> PAGEREF _Toc243227978 \h </w:instrText>
+          <w:instrText xml:space="preserve"> PAGEREF _Toc243238341 \h </w:instrText>
         </w:r>
         <w:r>
           <w:rPr>
@@ -3055,7 +3055,7 @@
           <w:noProof/>
         </w:rPr>
       </w:pPr>
-      <w:hyperlink w:anchor="_Toc243227979" w:history="1">
+      <w:hyperlink w:anchor="_Toc243238342" w:history="1">
         <w:r>
           <w:rPr>
             <w:rStyle w:val="Hyperlink"/>
@@ -3082,7 +3082,7 @@
             <w:noProof/>
             <w:webHidden/>
           </w:rPr>
-          <w:instrText xml:space="preserve"> PAGEREF _Toc243227979 \h </w:instrText>
+          <w:instrText xml:space="preserve"> PAGEREF _Toc243238342 \h </w:instrText>
         </w:r>
         <w:r>
           <w:rPr>
@@ -3123,7 +3123,7 @@
           <w:noProof/>
         </w:rPr>
       </w:pPr>
-      <w:hyperlink w:anchor="_Toc243227980" w:history="1">
+      <w:hyperlink w:anchor="_Toc243238343" w:history="1">
         <w:r>
           <w:rPr>
             <w:rStyle w:val="Hyperlink"/>
@@ -3150,7 +3150,7 @@
             <w:noProof/>
             <w:webHidden/>
           </w:rPr>
-          <w:instrText xml:space="preserve"> PAGEREF _Toc243227980 \h </w:instrText>
+          <w:instrText xml:space="preserve"> PAGEREF _Toc243238343 \h </w:instrText>
         </w:r>
         <w:r>
           <w:rPr>
@@ -3191,7 +3191,7 @@
           <w:noProof/>
         </w:rPr>
       </w:pPr>
-      <w:hyperlink w:anchor="_Toc243227981" w:history="1">
+      <w:hyperlink w:anchor="_Toc243238344" w:history="1">
         <w:r>
           <w:rPr>
             <w:rStyle w:val="Hyperlink"/>
@@ -3218,7 +3218,7 @@
             <w:noProof/>
             <w:webHidden/>
           </w:rPr>
-          <w:instrText xml:space="preserve"> PAGEREF _Toc243227981 \h </w:instrText>
+          <w:instrText xml:space="preserve"> PAGEREF _Toc243238344 \h </w:instrText>
         </w:r>
         <w:r>
           <w:rPr>
@@ -3259,7 +3259,7 @@
           <w:noProof/>
         </w:rPr>
       </w:pPr>
-      <w:hyperlink w:anchor="_Toc243227982" w:history="1">
+      <w:hyperlink w:anchor="_Toc243238345" w:history="1">
         <w:r>
           <w:rPr>
             <w:rStyle w:val="Hyperlink"/>
@@ -3286,7 +3286,7 @@
             <w:noProof/>
             <w:webHidden/>
           </w:rPr>
-          <w:instrText xml:space="preserve"> PAGEREF _Toc243227982 \h </w:instrText>
+          <w:instrText xml:space="preserve"> PAGEREF _Toc243238345 \h </w:instrText>
         </w:r>
         <w:r>
           <w:rPr>
@@ -3327,7 +3327,7 @@
           <w:noProof/>
         </w:rPr>
       </w:pPr>
-      <w:hyperlink w:anchor="_Toc243227983" w:history="1">
+      <w:hyperlink w:anchor="_Toc243238346" w:history="1">
         <w:r>
           <w:rPr>
             <w:rStyle w:val="Hyperlink"/>
@@ -3354,7 +3354,7 @@
             <w:noProof/>
             <w:webHidden/>
           </w:rPr>
-          <w:instrText xml:space="preserve"> PAGEREF _Toc243227983 \h </w:instrText>
+          <w:instrText xml:space="preserve"> PAGEREF _Toc243238346 \h </w:instrText>
         </w:r>
         <w:r>
           <w:rPr>
@@ -3404,7 +3404,7 @@
         <w:shd w:val="clear" w:color="auto" w:fill="0070C0"/>
         <w:spacing w:before="0" w:after="200" w:line="252" w:lineRule="auto"/>
       </w:pPr>
-      <w:bookmarkStart w:id="0" w:name="_Toc243227936"/>
+      <w:bookmarkStart w:id="0" w:name="_Toc243238299"/>
       <w:r>
         <w:rPr>
           <w:rFonts w:ascii="Arial" w:eastAsia="Arial" w:hAnsi="Arial"/>
@@ -4974,7 +4974,14 @@
                 <w:color w:val="1A1A1A"/>
                 <w:sz w:val="18"/>
               </w:rPr>
-              <w:t>. Revisão dos status de requisitos (RF-005 concluído; RF-007, RF-008 e RF-009 reclassificados conforme o código), inclusão do RF-015 e da RN-015 (direitos do titular — LGPD) e atualização do andamento do semestre (Parte 02).</w:t>
+              <w:t>. Publicação do sistema em produção na Vercel (https://prontuario-pro-pi.vercel.app). Revisão dos status de requisitos (RF-005 concluído; RF-007, RF-008 e RF-009 reclassificados conforme o código), inclusão do RF-015 e da RN-015 (direitos do titular — LGPD</w:t>
+            </w:r>
+            <w:r>
+              <w:rPr>
+                <w:color w:val="1A1A1A"/>
+                <w:sz w:val="18"/>
+              </w:rPr>
+              <w:t>) e atualização do andamento do semestre (Parte 02).</w:t>
             </w:r>
           </w:p>
         </w:tc>
@@ -4999,21 +5006,14 @@
         <w:shd w:val="clear" w:color="auto" w:fill="0070C0"/>
         <w:spacing w:before="0" w:after="200" w:line="252" w:lineRule="auto"/>
       </w:pPr>
-      <w:bookmarkStart w:id="1" w:name="_Toc243227937"/>
+      <w:bookmarkStart w:id="1" w:name="_Toc243238300"/>
       <w:r>
         <w:rPr>
           <w:rFonts w:ascii="Arial" w:eastAsia="Arial" w:hAnsi="Arial"/>
           <w:sz w:val="23"/>
         </w:rPr>
         <w:lastRenderedPageBreak/>
-        <w:t xml:space="preserve">PARTE 01  ·  </w:t>
-      </w:r>
-      <w:r>
-        <w:rPr>
-          <w:rFonts w:ascii="Arial" w:eastAsia="Arial" w:hAnsi="Arial"/>
-          <w:sz w:val="23"/>
-        </w:rPr>
-        <w:t>IDENTIFICAÇÃO DO PRODUTO, EQUIPE E REPOSITÓRIO</w:t>
+        <w:t>PARTE 01  ·  IDENTIFICAÇÃO DO PRODUTO, EQUIPE E REPOSITÓRIO</w:t>
       </w:r>
       <w:bookmarkEnd w:id="1"/>
     </w:p>
@@ -5025,7 +5025,7 @@
         </w:pBdr>
         <w:spacing w:before="240" w:after="40" w:line="252" w:lineRule="auto"/>
       </w:pPr>
-      <w:bookmarkStart w:id="2" w:name="_Toc243227938"/>
+      <w:bookmarkStart w:id="2" w:name="_Toc243238301"/>
       <w:r>
         <w:rPr>
           <w:rFonts w:ascii="Arial" w:eastAsia="Arial" w:hAnsi="Arial"/>
@@ -5151,7 +5151,7 @@
         </w:pBdr>
         <w:spacing w:before="240" w:after="40" w:line="252" w:lineRule="auto"/>
       </w:pPr>
-      <w:bookmarkStart w:id="3" w:name="_Toc243227939"/>
+      <w:bookmarkStart w:id="3" w:name="_Toc243238302"/>
       <w:r>
         <w:rPr>
           <w:rFonts w:ascii="Arial" w:eastAsia="Arial" w:hAnsi="Arial"/>
@@ -5202,7 +5202,7 @@
         <w:pStyle w:val="Ttulo3"/>
         <w:spacing w:before="160" w:after="60" w:line="252" w:lineRule="auto"/>
       </w:pPr>
-      <w:bookmarkStart w:id="4" w:name="_Toc243227940"/>
+      <w:bookmarkStart w:id="4" w:name="_Toc243238303"/>
       <w:r>
         <w:rPr>
           <w:rFonts w:ascii="Arial" w:eastAsia="Arial" w:hAnsi="Arial"/>
@@ -5294,7 +5294,7 @@
         <w:pStyle w:val="Ttulo3"/>
         <w:spacing w:before="160" w:after="60" w:line="252" w:lineRule="auto"/>
       </w:pPr>
-      <w:bookmarkStart w:id="5" w:name="_Toc243227941"/>
+      <w:bookmarkStart w:id="5" w:name="_Toc243238304"/>
       <w:r>
         <w:rPr>
           <w:rFonts w:ascii="Arial" w:eastAsia="Arial" w:hAnsi="Arial"/>
@@ -5737,7 +5737,7 @@
         </w:pBdr>
         <w:spacing w:before="240" w:after="40" w:line="252" w:lineRule="auto"/>
       </w:pPr>
-      <w:bookmarkStart w:id="6" w:name="_Toc243227942"/>
+      <w:bookmarkStart w:id="6" w:name="_Toc243238305"/>
       <w:r>
         <w:rPr>
           <w:rFonts w:ascii="Arial" w:eastAsia="Arial" w:hAnsi="Arial"/>
@@ -6581,7 +6581,7 @@
         </w:pBdr>
         <w:spacing w:before="240" w:after="40" w:line="252" w:lineRule="auto"/>
       </w:pPr>
-      <w:bookmarkStart w:id="7" w:name="_Toc243227943"/>
+      <w:bookmarkStart w:id="7" w:name="_Toc243238306"/>
       <w:r>
         <w:rPr>
           <w:rFonts w:ascii="Arial" w:eastAsia="Arial" w:hAnsi="Arial"/>
@@ -6981,6 +6981,7 @@
                 <w:color w:val="1A1A1A"/>
                 <w:sz w:val="18"/>
               </w:rPr>
+              <w:lastRenderedPageBreak/>
               <w:t>Aplicação Executável / Deploy</w:t>
             </w:r>
           </w:p>
@@ -7011,7 +7012,7 @@
                 <w:color w:val="1A1A1A"/>
                 <w:sz w:val="18"/>
               </w:rPr>
-              <w:t>Em elaboração — publicação prevista na Vercel</w:t>
+              <w:t>https://prontuario-pro-pi.vercel.app</w:t>
             </w:r>
           </w:p>
         </w:tc>
@@ -7041,14 +7042,14 @@
                 <w:color w:val="1A1A1A"/>
                 <w:sz w:val="18"/>
               </w:rPr>
-              <w:t xml:space="preserve">Ambiente onde o </w:t>
+              <w:t xml:space="preserve">Versão de produção hospedada na </w:t>
             </w:r>
             <w:r>
               <w:rPr>
                 <w:color w:val="1A1A1A"/>
                 <w:sz w:val="18"/>
               </w:rPr>
-              <w:t>Prontuário-Pro poderá ser acessado e testado.</w:t>
+              <w:t>Vercel, com deploy automático a cada atualização da branch main e conectada ao backend Supabase.</w:t>
             </w:r>
           </w:p>
         </w:tc>
@@ -7086,7 +7087,6 @@
                 <w:color w:val="1A1A1A"/>
                 <w:sz w:val="18"/>
               </w:rPr>
-              <w:lastRenderedPageBreak/>
               <w:t>Documentação técnica</w:t>
             </w:r>
           </w:p>
@@ -7149,14 +7149,14 @@
                 <w:color w:val="1A1A1A"/>
                 <w:sz w:val="18"/>
               </w:rPr>
-              <w:t xml:space="preserve">Este Documento de Especificação e as 18 migrations SQL comentadas, que documentam tabelas, políticas RLS, </w:t>
+              <w:t xml:space="preserve">Este Documento de Especificação e as 18 migrations SQL </w:t>
             </w:r>
             <w:r>
               <w:rPr>
                 <w:color w:val="1A1A1A"/>
                 <w:sz w:val="18"/>
               </w:rPr>
-              <w:t>funções e triggers.</w:t>
+              <w:t>comentadas, que documentam tabelas, políticas RLS, funções e triggers.</w:t>
             </w:r>
           </w:p>
         </w:tc>
@@ -7181,7 +7181,7 @@
         <w:shd w:val="clear" w:color="auto" w:fill="0070C0"/>
         <w:spacing w:before="0" w:after="200" w:line="252" w:lineRule="auto"/>
       </w:pPr>
-      <w:bookmarkStart w:id="8" w:name="_Toc243227944"/>
+      <w:bookmarkStart w:id="8" w:name="_Toc243238307"/>
       <w:r>
         <w:rPr>
           <w:rFonts w:ascii="Arial" w:eastAsia="Arial" w:hAnsi="Arial"/>
@@ -7200,7 +7200,7 @@
         </w:pBdr>
         <w:spacing w:before="240" w:after="40" w:line="252" w:lineRule="auto"/>
       </w:pPr>
-      <w:bookmarkStart w:id="9" w:name="_Toc243227945"/>
+      <w:bookmarkStart w:id="9" w:name="_Toc243238308"/>
       <w:r>
         <w:rPr>
           <w:rFonts w:ascii="Arial" w:eastAsia="Arial" w:hAnsi="Arial"/>
@@ -7247,13 +7247,19 @@
         <w:rPr>
           <w:color w:val="1A1A1A"/>
         </w:rPr>
-        <w:t xml:space="preserve">O Prontuário-Pro iniciou o 6º período após uma etapa de </w:t>
+        <w:t xml:space="preserve">O </w:t>
       </w:r>
       <w:r>
         <w:rPr>
           <w:color w:val="1A1A1A"/>
         </w:rPr>
-        <w:t>evolução significativa da solução. Durante o 5º período, foram consolidadas a arquitetura geral do sistema, as principais tecnologias do projeto e a implementação das interfaces utilizadas pelos diferentes perfis de usuário.</w:t>
+        <w:t>Prontuário-Pro iniciou o 6º período após uma etapa de evolução significativa da solução. Durante o 5º período, foram consolidadas a arquitetura geral do sistema, as principais tecnologias do projeto e a implementação das interfaces utilizadas pelos diferen</w:t>
+      </w:r>
+      <w:r>
+        <w:rPr>
+          <w:color w:val="1A1A1A"/>
+        </w:rPr>
+        <w:t>tes perfis de usuário.</w:t>
       </w:r>
     </w:p>
     <w:p>
@@ -7265,13 +7271,13 @@
         <w:rPr>
           <w:color w:val="1A1A1A"/>
         </w:rPr>
-        <w:t>Na Fase 01 do 6º período, o foc</w:t>
+        <w:t>Na Fase 01 do 6º período, o foco foi o aprofundamento do backend: revisão das regras de negócio, dos serviços responsáveis pelas funcionalidades, do acesso e da persistência dos dados e da correspondência entre a implementação técnic</w:t>
       </w:r>
       <w:r>
         <w:rPr>
           <w:color w:val="1A1A1A"/>
         </w:rPr>
-        <w:t>o foi o aprofundamento do backend: revisão das regras de negócio, dos serviços responsáveis pelas funcionalidades, do acesso e da persistência dos dados e da correspondência entre a implementação técnica e os requisitos documentados.</w:t>
+        <w:t>a e os requisitos documentados.</w:t>
       </w:r>
     </w:p>
     <w:p>
@@ -7290,19 +7296,13 @@
         <w:rPr>
           <w:color w:val="1A1A1A"/>
         </w:rPr>
-        <w:t xml:space="preserve"> O</w:t>
+        <w:t xml:space="preserve"> O sistema encontra-se com frontend e backend integrados de ponta a ponta. Todas as telas do médico e do paciente — com exceção do Painel de IA, que ainda utiliza dados simulados — leem e gravam dados rea</w:t>
       </w:r>
       <w:r>
         <w:rPr>
           <w:color w:val="1A1A1A"/>
         </w:rPr>
-        <w:t xml:space="preserve"> sistema encontra-se com frontend e backend integrados de ponta a ponta. Todas as telas do médico e do paciente — com exceção do Painel de IA, que ainda utiliza dados simulados — leem e gravam dados reais no PostgreSQL por meio do Supabase, com autenticaçã</w:t>
-      </w:r>
-      <w:r>
-        <w:rPr>
-          <w:color w:val="1A1A1A"/>
-        </w:rPr>
-        <w:t>o por JWT, autorização por Row Level Security, armazenamento de arquivos no Storage e notificações em tempo real pelo Realtime. Nesta fase foram concluídos:</w:t>
+        <w:t>is no PostgreSQL por meio do Supabase, com autenticação por JWT, autorização por Row Level Security, armazenamento de arquivos no Storage e notificações em tempo real pelo Realtime. Nesta fase foram concluídos:</w:t>
       </w:r>
     </w:p>
     <w:p>
@@ -7315,13 +7315,13 @@
         <w:rPr>
           <w:color w:val="1A1A1A"/>
         </w:rPr>
-        <w:t>integração completa dos fluxos de agenda, anamnese, prontuário, prescrição digital, documentos/exam</w:t>
+        <w:t>integração completa dos fluxos de agenda, ana</w:t>
       </w:r>
       <w:r>
         <w:rPr>
           <w:color w:val="1A1A1A"/>
         </w:rPr>
-        <w:t>es e notificações;</w:t>
+        <w:t>mnese, prontuário, prescrição digital, documentos/exames e notificações;</w:t>
       </w:r>
     </w:p>
     <w:p>
@@ -7402,13 +7402,7 @@
         <w:rPr>
           <w:color w:val="1A1A1A"/>
         </w:rPr>
-        <w:t xml:space="preserve">módulo de privacidade (LGPD): trilha de auditoria de </w:t>
-      </w:r>
-      <w:r>
-        <w:rPr>
-          <w:color w:val="1A1A1A"/>
-        </w:rPr>
-        <w:t>acessos, consentimentos e solicitação de encerramento de conta;</w:t>
+        <w:t>módulo de privacidade (LGPD): trilha de auditoria de acessos, consentimentos e solicitação de encerramento de conta;</w:t>
       </w:r>
     </w:p>
     <w:p>
@@ -7421,7 +7415,26 @@
         <w:rPr>
           <w:color w:val="1A1A1A"/>
         </w:rPr>
-        <w:t>regra de conflito de horário (RN-009) aplicada no banco e notificação ao médico quando o paciente solicita consulta (migration 018);</w:t>
+        <w:t xml:space="preserve">regra de conflito de horário (RN-009) aplicada no banco e </w:t>
+      </w:r>
+      <w:r>
+        <w:rPr>
+          <w:color w:val="1A1A1A"/>
+        </w:rPr>
+        <w:t>notificação ao médico quando o paciente solicita consulta (migration 018);</w:t>
+      </w:r>
+    </w:p>
+    <w:p>
+      <w:pPr>
+        <w:pStyle w:val="Commarcadores"/>
+        <w:spacing w:after="40" w:line="288" w:lineRule="auto"/>
+        <w:jc w:val="both"/>
+      </w:pPr>
+      <w:r>
+        <w:rPr>
+          <w:color w:val="1A1A1A"/>
+        </w:rPr>
+        <w:t>verificação técnica: compilação de tipos sem erros, lint sem erros, build de produção e 40 testes automatizados aprovados;</w:t>
       </w:r>
     </w:p>
     <w:p>
@@ -7434,13 +7447,13 @@
         <w:rPr>
           <w:color w:val="1A1A1A"/>
         </w:rPr>
-        <w:t>verificação técnica: compilação de tipos sem erros, lint se</w:t>
+        <w:t>publicação do sistema integrado em produção na Vercel (htt</w:t>
       </w:r>
       <w:r>
         <w:rPr>
           <w:color w:val="1A1A1A"/>
         </w:rPr>
-        <w:t>m erros, build de produção e 40 testes automatizados aprovados.</w:t>
+        <w:t>ps://prontuario-pro-pi.vercel.app), com deploy automático a partir do GitHub.</w:t>
       </w:r>
     </w:p>
     <w:p>
@@ -7452,13 +7465,13 @@
         <w:rPr>
           <w:color w:val="1A1A1A"/>
         </w:rPr>
-        <w:t>Permanecem pendentes para os próximos períodos: envio eletrônico da prescrição (RF-007), administração de perfis de funcionários (RF-008), integração do painel de IA com um serviço real (RF-00</w:t>
+        <w:t>Permanecem pendentes para os próximos períodos: envio eletrônico da prescrição (RF-007), administração de perfis de funcionários (RF-008), integração do painel de IA com um servi</w:t>
       </w:r>
       <w:r>
         <w:rPr>
           <w:color w:val="1A1A1A"/>
         </w:rPr>
-        <w:t>9), relatório de contas médicas (RF-003) e a publicação do ambiente de demonstração.</w:t>
+        <w:t>ço real (RF-009), e relatório de contas médicas (RF-003).</w:t>
       </w:r>
     </w:p>
     <w:p>
@@ -7469,7 +7482,7 @@
         </w:pBdr>
         <w:spacing w:before="240" w:after="40" w:line="252" w:lineRule="auto"/>
       </w:pPr>
-      <w:bookmarkStart w:id="10" w:name="_Toc243227946"/>
+      <w:bookmarkStart w:id="10" w:name="_Toc243238309"/>
       <w:r>
         <w:rPr>
           <w:rFonts w:ascii="Arial" w:eastAsia="Arial" w:hAnsi="Arial"/>
@@ -7516,13 +7529,13 @@
         <w:rPr>
           <w:color w:val="1A1A1A"/>
         </w:rPr>
-        <w:t xml:space="preserve">Durante o 6º período, o objetivo principal da </w:t>
+        <w:t xml:space="preserve">Durante o 6º período, o objetivo principal da equipe é consolidar o núcleo </w:t>
       </w:r>
       <w:r>
         <w:rPr>
           <w:color w:val="1A1A1A"/>
         </w:rPr>
-        <w:t>equipe é consolidar o núcleo funcional do Prontuário-Pro, aprofundando a implementação do backend, das regras de negócio, da persistência dos dados e da integração entre as camadas. A tabela abaixo registra o andamento de cada objetivo ao final da Fase 02.</w:t>
+        <w:t>funcional do Prontuário-Pro, aprofundando a implementação do backend, das regras de negócio, da persistência dos dados e da integração entre as camadas. A tabela abaixo registra o andamento de cada objetivo ao final da Fase 02.</w:t>
       </w:r>
     </w:p>
     <w:tbl>
@@ -7743,14 +7756,14 @@
                 <w:color w:val="1A1A1A"/>
                 <w:sz w:val="18"/>
               </w:rPr>
-              <w:t xml:space="preserve"> — 18 migrations versionadas</w:t>
+              <w:t xml:space="preserve"> — 18 migrations versionadas, 19 funções PL/pgSQL e polít</w:t>
             </w:r>
             <w:r>
               <w:rPr>
                 <w:color w:val="1A1A1A"/>
                 <w:sz w:val="18"/>
               </w:rPr>
-              <w:t>, 19 funções PL/pgSQL e políticas RLS em todas as tabelas.</w:t>
+              <w:t>icas RLS em todas as tabelas.</w:t>
             </w:r>
           </w:p>
         </w:tc>
@@ -7964,14 +7977,7 @@
                 <w:color w:val="1A1A1A"/>
                 <w:sz w:val="18"/>
               </w:rPr>
-              <w:t xml:space="preserve"> — chaves estrangeiras, restrições CHECK/</w:t>
-            </w:r>
-            <w:r>
-              <w:rPr>
-                <w:color w:val="1A1A1A"/>
-                <w:sz w:val="18"/>
-              </w:rPr>
-              <w:t>UNIQUE, índices e triggers de integridade.</w:t>
+              <w:t xml:space="preserve"> — chaves estrangeiras, restrições CHECK/UNIQUE, índices e triggers de integridade.</w:t>
             </w:r>
           </w:p>
         </w:tc>
@@ -8292,14 +8298,14 @@
                 <w:color w:val="1A1A1A"/>
                 <w:sz w:val="18"/>
               </w:rPr>
-              <w:t>Em andamento</w:t>
+              <w:t>Concluído</w:t>
             </w:r>
             <w:r>
               <w:rPr>
                 <w:color w:val="1A1A1A"/>
                 <w:sz w:val="18"/>
               </w:rPr>
-              <w:t xml:space="preserve"> — código organizado por camadas e testado; publicação do deploy pendente.</w:t>
+              <w:t xml:space="preserve"> — código organizado por camadas e testado; aplicação publicada na Vercel com deploy contínuo.</w:t>
             </w:r>
           </w:p>
         </w:tc>
@@ -8318,20 +8324,20 @@
         </w:pBdr>
         <w:spacing w:before="240" w:after="40" w:line="252" w:lineRule="auto"/>
       </w:pPr>
-      <w:bookmarkStart w:id="11" w:name="_Toc243227947"/>
+      <w:bookmarkStart w:id="11" w:name="_Toc243238310"/>
       <w:r>
         <w:rPr>
           <w:rFonts w:ascii="Arial" w:eastAsia="Arial" w:hAnsi="Arial"/>
           <w:sz w:val="22"/>
         </w:rPr>
-        <w:t xml:space="preserve">7 CRONOGRAMA DO </w:t>
+        <w:t xml:space="preserve">7 </w:t>
       </w:r>
       <w:r>
         <w:rPr>
           <w:rFonts w:ascii="Arial" w:eastAsia="Arial" w:hAnsi="Arial"/>
           <w:sz w:val="22"/>
         </w:rPr>
-        <w:t>SEMESTRE</w:t>
+        <w:t>CRONOGRAMA DO SEMESTRE</w:t>
       </w:r>
       <w:bookmarkEnd w:id="11"/>
     </w:p>
@@ -8645,14 +8651,7 @@
                 <w:color w:val="1A1A1A"/>
                 <w:sz w:val="18"/>
               </w:rPr>
-              <w:t xml:space="preserve">Revisão das </w:t>
-            </w:r>
-            <w:r>
-              <w:rPr>
-                <w:color w:val="1A1A1A"/>
-                <w:sz w:val="18"/>
-              </w:rPr>
-              <w:t>regras de negócio, requisitos funcionais e modelo de dados.</w:t>
+              <w:t>Revisão das regras de negócio, requisitos funcionais e modelo de dados.</w:t>
             </w:r>
           </w:p>
         </w:tc>
@@ -9154,14 +9153,14 @@
                 <w:color w:val="1A1A1A"/>
                 <w:sz w:val="18"/>
               </w:rPr>
-              <w:t xml:space="preserve">Testes dos fluxos integrados, correção de </w:t>
+              <w:t xml:space="preserve">Testes dos fluxos </w:t>
             </w:r>
             <w:r>
               <w:rPr>
                 <w:color w:val="1A1A1A"/>
                 <w:sz w:val="18"/>
               </w:rPr>
-              <w:t>inconsistências e atualização da arquitetura.</w:t>
+              <w:t>integrados, correção de inconsistências e atualização da arquitetura.</w:t>
             </w:r>
           </w:p>
         </w:tc>
@@ -9319,21 +9318,21 @@
         <w:shd w:val="clear" w:color="auto" w:fill="0070C0"/>
         <w:spacing w:before="0" w:after="200" w:line="252" w:lineRule="auto"/>
       </w:pPr>
-      <w:bookmarkStart w:id="12" w:name="_Toc243227948"/>
+      <w:bookmarkStart w:id="12" w:name="_Toc243238311"/>
       <w:r>
         <w:rPr>
           <w:rFonts w:ascii="Arial" w:eastAsia="Arial" w:hAnsi="Arial"/>
           <w:sz w:val="23"/>
         </w:rPr>
         <w:lastRenderedPageBreak/>
-        <w:t xml:space="preserve">PARTE 03  ·  ENTENDIMENTO DO PÚBLICO, DO NEGÓCIO E LEVANTAMENTO INICIAL DE </w:t>
+        <w:t xml:space="preserve">PARTE 03  ·  ENTENDIMENTO DO PÚBLICO, DO NEGÓCIO E </w:t>
       </w:r>
       <w:r>
         <w:rPr>
           <w:rFonts w:ascii="Arial" w:eastAsia="Arial" w:hAnsi="Arial"/>
           <w:sz w:val="23"/>
         </w:rPr>
-        <w:t>REQUISITOS</w:t>
+        <w:t>LEVANTAMENTO INICIAL DE REQUISITOS</w:t>
       </w:r>
       <w:bookmarkEnd w:id="12"/>
     </w:p>
@@ -9345,7 +9344,7 @@
         </w:pBdr>
         <w:spacing w:before="240" w:after="40" w:line="252" w:lineRule="auto"/>
       </w:pPr>
-      <w:bookmarkStart w:id="13" w:name="_Toc243227949"/>
+      <w:bookmarkStart w:id="13" w:name="_Toc243238312"/>
       <w:r>
         <w:rPr>
           <w:rFonts w:ascii="Arial" w:eastAsia="Arial" w:hAnsi="Arial"/>
@@ -9392,7 +9391,13 @@
         <w:rPr>
           <w:color w:val="1A1A1A"/>
         </w:rPr>
-        <w:t>O Prontuário-Pro foi desenvolvido para atender os seguintes perfis de usuário em clínicas de pequeno e médio porte:</w:t>
+        <w:t>O Prontuário-Pro foi desenvolvido para atender os seguintes perfis de usuário em clínicas de pequeno e médio por</w:t>
+      </w:r>
+      <w:r>
+        <w:rPr>
+          <w:color w:val="1A1A1A"/>
+        </w:rPr>
+        <w:t>te:</w:t>
       </w:r>
     </w:p>
     <w:p>
@@ -9412,19 +9417,13 @@
         <w:rPr>
           <w:color w:val="1A1A1A"/>
         </w:rPr>
-        <w:t xml:space="preserve"> usuários </w:t>
+        <w:t xml:space="preserve"> usuários que acompanham o próprio histórico clínico pela plataforma. Consultam prontuário, anamneses, prescrições e exames, solicitam agendamento com os especialistas disponíveis e recebem notificações sobre suas consultas, sem depender de c</w:t>
       </w:r>
       <w:r>
         <w:rPr>
           <w:color w:val="1A1A1A"/>
         </w:rPr>
-        <w:t xml:space="preserve">que acompanham o próprio histórico clínico pela plataforma. Consultam prontuário, anamneses, prescrições e exames, solicitam agendamento com os especialistas disponíveis e recebem notificações sobre suas consultas, sem depender de contato telefônico com a </w:t>
-      </w:r>
-      <w:r>
-        <w:rPr>
-          <w:color w:val="1A1A1A"/>
-        </w:rPr>
-        <w:t>clínica.</w:t>
+        <w:t>ontato telefônico com a clínica.</w:t>
       </w:r>
     </w:p>
     <w:p>
@@ -9444,13 +9443,13 @@
         <w:rPr>
           <w:color w:val="1A1A1A"/>
         </w:rPr>
-        <w:t xml:space="preserve"> usuários que precisam centralizar o histórico clínico dos pacientes para tomadas de decisão rápidas e seguras. Buscam eliminar o uso de papel e garantir que suas prescrições digitais tenham validade jurídica e ras</w:t>
+        <w:t xml:space="preserve"> usuários que precisam centralizar o histórico clínico dos pacientes para tomadas de decisão rápidas e seguras. Buscam eliminar o uso de papel e garantir que suas prescrições digitais tenham</w:t>
       </w:r>
       <w:r>
         <w:rPr>
           <w:color w:val="1A1A1A"/>
         </w:rPr>
-        <w:t>treabilidade, utilizando ferramentas como o QR Code para evitar erros de dispensação em farmácias.</w:t>
+        <w:t xml:space="preserve"> validade jurídica e rastreabilidade, utilizando ferramentas como o QR Code para evitar erros de dispensação em farmácias.</w:t>
       </w:r>
     </w:p>
     <w:p>
@@ -9470,13 +9469,13 @@
         <w:rPr>
           <w:color w:val="1A1A1A"/>
         </w:rPr>
-        <w:t xml:space="preserve"> profissionais responsáveis pela linha de frente da clínica. Sua principal necessidade é uma agenda inteligente que evite a sobr</w:t>
+        <w:t xml:space="preserve"> profissionais responsáveis pela linha de frente da clínica. Sua principal necessidade é uma agenda inte</w:t>
       </w:r>
       <w:r>
         <w:rPr>
           <w:color w:val="1A1A1A"/>
         </w:rPr>
-        <w:t>eposição de horários e facilite a remarcação rápida, reduzindo o impacto de cancelamentos de última hora no fluxo de caixa da clínica.</w:t>
+        <w:t>ligente que evite a sobreposição de horários e facilite a remarcação rápida, reduzindo o impacto de cancelamentos de última hora no fluxo de caixa da clínica.</w:t>
       </w:r>
     </w:p>
     <w:p>
@@ -9496,13 +9495,13 @@
         <w:rPr>
           <w:color w:val="1A1A1A"/>
         </w:rPr>
-        <w:t xml:space="preserve"> gestores que buscam conformidade com normas legais, como a LGPD, e proteção contra a perda d</w:t>
+        <w:t xml:space="preserve"> gestores que buscam conformidade com normas legais, como a LGPD, e p</w:t>
       </w:r>
       <w:r>
         <w:rPr>
           <w:color w:val="1A1A1A"/>
         </w:rPr>
-        <w:t>e dados. Precisam de uma visão clara da produtividade da clínica e ferramentas que garantam que as informações sensíveis dos pacientes estejam protegidas por criptografia e backups automatizados.</w:t>
+        <w:t>roteção contra a perda de dados. Precisam de uma visão clara da produtividade da clínica e ferramentas que garantam que as informações sensíveis dos pacientes estejam protegidas por criptografia e backups automatizados.</w:t>
       </w:r>
     </w:p>
     <w:p>
@@ -9514,13 +9513,13 @@
         <w:rPr>
           <w:color w:val="1A1A1A"/>
         </w:rPr>
-        <w:t>Na implementação atual, o sistema opera com dois perfis de a</w:t>
+        <w:t>Na implementação atual, o sistema op</w:t>
       </w:r>
       <w:r>
         <w:rPr>
           <w:color w:val="1A1A1A"/>
         </w:rPr>
-        <w:t xml:space="preserve">cesso — paciente e médico —, definidos no campo </w:t>
+        <w:t xml:space="preserve">era com dois perfis de acesso — paciente e médico —, definidos no campo </w:t>
       </w:r>
       <w:r>
         <w:rPr>
@@ -9548,13 +9547,13 @@
         <w:rPr>
           <w:color w:val="1A1A1A"/>
         </w:rPr>
-        <w:t xml:space="preserve"> e aplicados tanto nas rotas protegidas do frontend quanto nas políticas de Row Level Security do banco de dados. As necessidades de recepção e de administração da clínica estão previst</w:t>
+        <w:t xml:space="preserve"> e aplicados tanto nas rotas protegidas do frontend quanto nas políticas de Row Level Security do banco de dados. As necessidades de recepção e de administração </w:t>
       </w:r>
       <w:r>
         <w:rPr>
           <w:color w:val="1A1A1A"/>
         </w:rPr>
-        <w:t>as como evolução da solução nos períodos seguintes.</w:t>
+        <w:t>da clínica estão previstas como evolução da solução nos períodos seguintes.</w:t>
       </w:r>
     </w:p>
     <w:p>
@@ -9565,7 +9564,7 @@
         </w:pBdr>
         <w:spacing w:before="240" w:after="40" w:line="252" w:lineRule="auto"/>
       </w:pPr>
-      <w:bookmarkStart w:id="14" w:name="_Toc243227950"/>
+      <w:bookmarkStart w:id="14" w:name="_Toc243238313"/>
       <w:r>
         <w:rPr>
           <w:rFonts w:ascii="Arial" w:eastAsia="Arial" w:hAnsi="Arial"/>
@@ -9612,13 +9611,19 @@
         <w:rPr>
           <w:color w:val="1A1A1A"/>
         </w:rPr>
-        <w:t xml:space="preserve">O Prontuário-Pro insere-se no setor de saúde suplementar, focando especificamente na digitalização e </w:t>
+        <w:t xml:space="preserve">O Prontuário-Pro insere-se no setor de saúde suplementar, focando </w:t>
       </w:r>
       <w:r>
         <w:rPr>
           <w:color w:val="1A1A1A"/>
         </w:rPr>
-        <w:t>otimização de clínicas de pequeno e médio porte. O cenário de atuação é caracterizado por um fluxo intenso de dados sensíveis que, atualmente, muitas vezes são geridos de forma fragmentada (papéis, planilhas isoladas ou softwares legados sem integração).</w:t>
+        <w:t>especificamente na digitalização e otimização de clínicas de pequeno e médio porte. O cenário de atuação é caracterizado por um fluxo intenso de dados sensíveis que, atualmente, muitas vezes são geridos de forma fragmentada (papéis, planilhas isoladas ou s</w:t>
+      </w:r>
+      <w:r>
+        <w:rPr>
+          <w:color w:val="1A1A1A"/>
+        </w:rPr>
+        <w:t>oftwares legados sem integração).</w:t>
       </w:r>
     </w:p>
     <w:p>
@@ -9630,13 +9635,7 @@
         <w:rPr>
           <w:color w:val="1A1A1A"/>
         </w:rPr>
-        <w:t>N</w:t>
-      </w:r>
-      <w:r>
-        <w:rPr>
-          <w:color w:val="1A1A1A"/>
-        </w:rPr>
-        <w:t>este contexto, o sistema atua em três pilares fundamentais:</w:t>
+        <w:t>Neste contexto, o sistema atua em três pilares fundamentais:</w:t>
       </w:r>
     </w:p>
     <w:p>
@@ -9656,13 +9655,13 @@
         <w:rPr>
           <w:color w:val="1A1A1A"/>
         </w:rPr>
-        <w:t xml:space="preserve"> em clínicas menores, o retrabalho causado por agendas mal geridas ou prontuários ilegíveis gera perda direta de receita. A solução automatiza o fluxo en</w:t>
+        <w:t xml:space="preserve"> em clínicas menores, o retrabalho causado por agendas mal geridas ou prontuários ilegíveis gera perda direta de recei</w:t>
       </w:r>
       <w:r>
         <w:rPr>
           <w:color w:val="1A1A1A"/>
         </w:rPr>
-        <w:t>tre a recepção e o consultório, garantindo que o médico receba o paciente com o histórico já disponível e atualizado em tempo real.</w:t>
+        <w:t>ta. A solução automatiza o fluxo entre a recepção e o consultório, garantindo que o médico receba o paciente com o histórico já disponível e atualizado em tempo real.</w:t>
       </w:r>
     </w:p>
     <w:p>
@@ -9682,19 +9681,19 @@
         <w:rPr>
           <w:color w:val="1A1A1A"/>
         </w:rPr>
-        <w:t xml:space="preserve"> o setor de saúde é rigorosamente regulado pela LGPD (Lei Geral de Proteção de Dados). O c</w:t>
+        <w:t xml:space="preserve"> o setor de saúde é rigorosamente regulado pela LGPD (L</w:t>
       </w:r>
       <w:r>
         <w:rPr>
           <w:color w:val="1A1A1A"/>
         </w:rPr>
-        <w:t>ontexto de negócio exige que o trânsito de informações entre médico e paciente (como a prescrição digital) seja rastreável e inviolável. O uso de criptografia e logs de auditoria no sistema transforma a conformidade legal em um diferencial competitivo para</w:t>
+        <w:t>ei Geral de Proteção de Dados). O contexto de negócio exige que o trânsito de informações entre médico e paciente (como a prescrição digital) seja rastreável e inviolável. O uso de criptografia e logs de auditoria no sistema transforma a conformidade legal</w:t>
       </w:r>
       <w:r>
         <w:rPr>
           <w:color w:val="1A1A1A"/>
         </w:rPr>
-        <w:t xml:space="preserve"> a clínica.</w:t>
+        <w:t xml:space="preserve"> em um diferencial competitivo para a clínica.</w:t>
       </w:r>
     </w:p>
     <w:p>
@@ -9715,13 +9714,13 @@
         <w:rPr>
           <w:color w:val="1A1A1A"/>
         </w:rPr>
-        <w:t xml:space="preserve"> o diferencial estratégico do negócio reside na transformação de dados brutos em apoio clínico. Ao centralizar os dados, o sistema permite que o gestor identifique padrões de atendimento e que o médico receba s</w:t>
+        <w:t xml:space="preserve"> o diferencial estratégico do negócio reside na transformação de dados brutos em apoio clínico. Ao centralizar os dados, o sistema permite que o gestor identifique padrões de </w:t>
       </w:r>
       <w:r>
         <w:rPr>
           <w:color w:val="1A1A1A"/>
         </w:rPr>
-        <w:t>uporte de módulos de IA para decisões mais precisas, elevando o padrão de cuidado ao paciente.</w:t>
+        <w:t>atendimento e que o médico receba suporte de módulos de IA para decisões mais precisas, elevando o padrão de cuidado ao paciente.</w:t>
       </w:r>
     </w:p>
     <w:p>
@@ -9733,13 +9732,13 @@
         <w:rPr>
           <w:color w:val="1A1A1A"/>
         </w:rPr>
-        <w:t xml:space="preserve">O Prontuário-Pro, portanto, não é apenas uma ferramenta de registro, mas um hub centralizador que busca reduzir o erro humano e acelerar o ciclo de </w:t>
+        <w:t xml:space="preserve">O Prontuário-Pro, portanto, não é apenas uma ferramenta de registro, mas um hub centralizador que busca reduzir o erro </w:t>
       </w:r>
       <w:r>
         <w:rPr>
           <w:color w:val="1A1A1A"/>
         </w:rPr>
-        <w:t>atendimento, desde o agendamento até a saída da prescrição autenticada.</w:t>
+        <w:t>humano e acelerar o ciclo de atendimento, desde o agendamento até a saída da prescrição autenticada.</w:t>
       </w:r>
     </w:p>
     <w:p>
@@ -9750,7 +9749,7 @@
         </w:pBdr>
         <w:spacing w:before="240" w:after="40" w:line="252" w:lineRule="auto"/>
       </w:pPr>
-      <w:bookmarkStart w:id="15" w:name="_Toc243227951"/>
+      <w:bookmarkStart w:id="15" w:name="_Toc243238314"/>
       <w:r>
         <w:rPr>
           <w:rFonts w:ascii="Arial" w:eastAsia="Arial" w:hAnsi="Arial"/>
@@ -9797,13 +9796,13 @@
         <w:rPr>
           <w:color w:val="1A1A1A"/>
         </w:rPr>
-        <w:t>O mercado brasileiro de gestão clínica conta com soluções consolidadas. Três delas foram analisad</w:t>
+        <w:t>O mercado brasileiro de gestão clínica conta com soluções consolidad</w:t>
       </w:r>
       <w:r>
         <w:rPr>
           <w:color w:val="1A1A1A"/>
         </w:rPr>
-        <w:t>as como referência para posicionar o Prontuário-Pro:</w:t>
+        <w:t>as. Três delas foram analisadas como referência para posicionar o Prontuário-Pro:</w:t>
       </w:r>
     </w:p>
     <w:tbl>
@@ -10050,14 +10049,7 @@
                 <w:color w:val="1A1A1A"/>
                 <w:sz w:val="17"/>
               </w:rPr>
-              <w:t xml:space="preserve">Agenda integrada ao </w:t>
-            </w:r>
-            <w:r>
-              <w:rPr>
-                <w:color w:val="1A1A1A"/>
-                <w:sz w:val="17"/>
-              </w:rPr>
-              <w:t>prontuário, com agendamento online e lembretes por WhatsApp, SMS e e-mail.</w:t>
+              <w:t>Agenda integrada ao prontuário, com agendamento online e lembretes por WhatsApp, SMS e e-mail.</w:t>
             </w:r>
           </w:p>
         </w:tc>
@@ -10156,14 +10148,14 @@
                 <w:color w:val="1A1A1A"/>
                 <w:sz w:val="17"/>
               </w:rPr>
-              <w:t xml:space="preserve">Prontuário Eletrônico do Paciente com anamneses e evoluções personalizáveis por </w:t>
-            </w:r>
-            <w:r>
-              <w:rPr>
-                <w:color w:val="1A1A1A"/>
-                <w:sz w:val="17"/>
-              </w:rPr>
-              <w:t>especialidade.</w:t>
+              <w:t xml:space="preserve">Prontuário Eletrônico do Paciente com anamneses e evoluções </w:t>
+            </w:r>
+            <w:r>
+              <w:rPr>
+                <w:color w:val="1A1A1A"/>
+                <w:sz w:val="17"/>
+              </w:rPr>
+              <w:t>personalizáveis por especialidade.</w:t>
             </w:r>
           </w:p>
         </w:tc>
@@ -10292,14 +10284,7 @@
                 <w:color w:val="1A1A1A"/>
                 <w:sz w:val="17"/>
               </w:rPr>
-              <w:t xml:space="preserve">Prontuário por </w:t>
-            </w:r>
-            <w:r>
-              <w:rPr>
-                <w:color w:val="1A1A1A"/>
-                <w:sz w:val="17"/>
-              </w:rPr>
-              <w:t>especialidade com linha do tempo do paciente e questionários personalizados.</w:t>
+              <w:t>Prontuário por especialidade com linha do tempo do paciente e questionários personalizados.</w:t>
             </w:r>
           </w:p>
         </w:tc>
@@ -10359,7 +10344,14 @@
                 <w:color w:val="1A1A1A"/>
                 <w:sz w:val="17"/>
               </w:rPr>
-              <w:t>Portal AmpliSaúde para histórico, exames e receitas; prescrição digital integrada.</w:t>
+              <w:t xml:space="preserve">Portal AmpliSaúde para histórico, exames e receitas; prescrição digital </w:t>
+            </w:r>
+            <w:r>
+              <w:rPr>
+                <w:color w:val="1A1A1A"/>
+                <w:sz w:val="17"/>
+              </w:rPr>
+              <w:t>integrada.</w:t>
             </w:r>
           </w:p>
         </w:tc>
@@ -10490,14 +10482,14 @@
                 <w:color w:val="1A1A1A"/>
                 <w:sz w:val="17"/>
               </w:rPr>
-              <w:t>Área do paciente p</w:t>
-            </w:r>
-            <w:r>
-              <w:rPr>
-                <w:color w:val="1A1A1A"/>
-                <w:sz w:val="17"/>
-              </w:rPr>
-              <w:t>ara prontuário, receitas e exames; prescrição digital com QR Code de validação pública.</w:t>
+              <w:t>Área d</w:t>
+            </w:r>
+            <w:r>
+              <w:rPr>
+                <w:color w:val="1A1A1A"/>
+                <w:sz w:val="17"/>
+              </w:rPr>
+              <w:t>o paciente para prontuário, receitas e exames; prescrição digital com QR Code de validação pública.</w:t>
             </w:r>
           </w:p>
         </w:tc>
@@ -10517,13 +10509,19 @@
         <w:rPr>
           <w:color w:val="1A1A1A"/>
         </w:rPr>
-        <w:t xml:space="preserve">As três soluções são plataformas comerciais amplas, que incluem faturamento TISS, telemedicina e gestão financeira — escopo muito superior ao de um projeto </w:t>
+        <w:t xml:space="preserve">As três soluções são plataformas comerciais amplas, que incluem faturamento TISS, telemedicina e gestão financeira — escopo muito superior ao de um </w:t>
       </w:r>
       <w:r>
         <w:rPr>
           <w:color w:val="1A1A1A"/>
         </w:rPr>
-        <w:t>acadêmico. O posicionamento do Prontuário-Pro é distinto: concentra-se no núcleo clínico do atendimento e na participação direta do paciente, com uma interface reduzida a poucas interações (RNF-002) e controle de acesso aplicado na própria camada de dados.</w:t>
+        <w:t>projeto acadêmico. O posicionamento do Prontuário-Pro é distinto: concentra-se no núcleo clínico do atendimento e na participação direta do paciente, com uma interface reduzida a poucas interações (RNF-002) e controle de acesso aplicado na própria camada d</w:t>
+      </w:r>
+      <w:r>
+        <w:rPr>
+          <w:color w:val="1A1A1A"/>
+        </w:rPr>
+        <w:t>e dados.</w:t>
       </w:r>
     </w:p>
     <w:p>
@@ -10546,7 +10544,7 @@
         </w:pBdr>
         <w:spacing w:before="240" w:after="40" w:line="252" w:lineRule="auto"/>
       </w:pPr>
-      <w:bookmarkStart w:id="16" w:name="_Toc243227952"/>
+      <w:bookmarkStart w:id="16" w:name="_Toc243238315"/>
       <w:r>
         <w:rPr>
           <w:rFonts w:ascii="Arial" w:eastAsia="Arial" w:hAnsi="Arial"/>
@@ -10595,14 +10593,14 @@
           <w:b/>
           <w:color w:val="1A1A1A"/>
         </w:rPr>
-        <w:t>Entrevistas Qu</w:t>
+        <w:t>Entrev</w:t>
       </w:r>
       <w:r>
         <w:rPr>
           <w:b/>
           <w:color w:val="1A1A1A"/>
         </w:rPr>
-        <w:t>alitativas:</w:t>
+        <w:t>istas Qualitativas:</w:t>
       </w:r>
       <w:r>
         <w:rPr>
@@ -10629,13 +10627,13 @@
         <w:rPr>
           <w:color w:val="1A1A1A"/>
         </w:rPr>
-        <w:t xml:space="preserve"> aplicado via Google Forms a profissionais da área para validar a aceitação de uma interface focada em “máximo 3 cli</w:t>
+        <w:t xml:space="preserve"> aplicado via Google Forms a profissionais da área para validar a aceitação de uma interface focada em “máxi</w:t>
       </w:r>
       <w:r>
         <w:rPr>
           <w:color w:val="1A1A1A"/>
         </w:rPr>
-        <w:t>ques” (RNF-002). Até o momento o formulário registrou uma única resposta, o que não permite tratamento estatístico; a coleta segue aberta e os resultados quantitativos serão consolidados quando a amostra for suficiente.</w:t>
+        <w:t>mo 3 cliques” (RNF-002). Até o momento o formulário registrou uma única resposta, o que não permite tratamento estatístico; a coleta segue aberta e os resultados quantitativos serão consolidados quando a amostra for suficiente.</w:t>
       </w:r>
     </w:p>
     <w:p>
@@ -10646,20 +10644,20 @@
         </w:pBdr>
         <w:spacing w:before="240" w:after="40" w:line="252" w:lineRule="auto"/>
       </w:pPr>
-      <w:bookmarkStart w:id="17" w:name="_Toc243227953"/>
+      <w:bookmarkStart w:id="17" w:name="_Toc243238316"/>
       <w:r>
         <w:rPr>
           <w:rFonts w:ascii="Arial" w:eastAsia="Arial" w:hAnsi="Arial"/>
           <w:sz w:val="22"/>
         </w:rPr>
-        <w:t>12 RESULTADOS DE PESQUISA COM USUÁRI</w:t>
+        <w:t>12 RESULTADOS DE PESQUISA CO</w:t>
       </w:r>
       <w:r>
         <w:rPr>
           <w:rFonts w:ascii="Arial" w:eastAsia="Arial" w:hAnsi="Arial"/>
           <w:sz w:val="22"/>
         </w:rPr>
-        <w:t>O</w:t>
+        <w:t>M USUÁRIO</w:t>
       </w:r>
       <w:bookmarkEnd w:id="17"/>
     </w:p>
@@ -10722,19 +10720,20 @@
           <w:b/>
           <w:color w:val="1A1A1A"/>
         </w:rPr>
-        <w:t>Impacto no projeto:</w:t>
-      </w:r>
-      <w:r>
-        <w:rPr>
+        <w:t>Impacto no projeto</w:t>
+      </w:r>
+      <w:r>
+        <w:rPr>
+          <w:b/>
           <w:color w:val="1A1A1A"/>
         </w:rPr>
-        <w:t xml:space="preserve"> isso l</w:t>
+        <w:t>:</w:t>
       </w:r>
       <w:r>
         <w:rPr>
           <w:color w:val="1A1A1A"/>
         </w:rPr>
-        <w:t xml:space="preserve">evou à criação do RF-006 (Gerenciar Agenda) e da RN-009, cuja validação passou a ser feita pelo backend na Fase 02 do 6º período (trigger </w:t>
+        <w:t xml:space="preserve"> isso levou à criação do RF-006 (Gerenciar Agenda) e da RN-009, cuja validação passou a ser feita pelo backend na Fase 02 do 6º período (trigger </w:t>
       </w:r>
       <w:r>
         <w:rPr>
@@ -10768,13 +10767,13 @@
         <w:rPr>
           <w:color w:val="1A1A1A"/>
         </w:rPr>
-        <w:t xml:space="preserve"> médicos demonstraram resistência à prescrição digital sem validade jurídica, </w:t>
+        <w:t xml:space="preserve"> médicos demonstraram resistência à prescrição digital sem validade ju</w:t>
       </w:r>
       <w:r>
         <w:rPr>
           <w:color w:val="1A1A1A"/>
         </w:rPr>
-        <w:t>resultando na inclusão de suporte à certificação ICP-Brasil (RF-004) como evolução e na validação pública da receita por QR Code (RF-005).</w:t>
+        <w:t>rídica, resultando na inclusão de suporte à certificação ICP-Brasil (RF-004) como evolução e na validação pública da receita por QR Code (RF-005).</w:t>
       </w:r>
     </w:p>
     <w:p>
@@ -10785,7 +10784,7 @@
         </w:pBdr>
         <w:spacing w:before="240" w:after="40" w:line="252" w:lineRule="auto"/>
       </w:pPr>
-      <w:bookmarkStart w:id="18" w:name="_Toc243227954"/>
+      <w:bookmarkStart w:id="18" w:name="_Toc243238317"/>
       <w:r>
         <w:rPr>
           <w:rFonts w:ascii="Arial" w:eastAsia="Arial" w:hAnsi="Arial"/>
@@ -10832,19 +10831,19 @@
         <w:rPr>
           <w:color w:val="1A1A1A"/>
         </w:rPr>
-        <w:t>As regras de negócio do Prontuár</w:t>
+        <w:t xml:space="preserve">As regras de negócio do </w:t>
       </w:r>
       <w:r>
         <w:rPr>
           <w:color w:val="1A1A1A"/>
         </w:rPr>
-        <w:t>io-Pro definem as condições, restrições e comportamentos que devem ser respeitados durante a utilização do sistema. Elas foram revisadas para representar de forma fiel os fluxos atualmente existentes entre pacientes, profissionais de saúde e demais usuário</w:t>
+        <w:t>Prontuário-Pro definem as condições, restrições e comportamentos que devem ser respeitados durante a utilização do sistema. Elas foram revisadas para representar de forma fiel os fluxos atualmente existentes entre pacientes, profissionais de saúde e demais</w:t>
       </w:r>
       <w:r>
         <w:rPr>
           <w:color w:val="1A1A1A"/>
         </w:rPr>
-        <w:t>s da plataforma.</w:t>
+        <w:t xml:space="preserve"> usuários da plataforma.</w:t>
       </w:r>
     </w:p>
     <w:tbl>
@@ -12812,7 +12811,7 @@
         </w:pBdr>
         <w:spacing w:before="240" w:after="40" w:line="252" w:lineRule="auto"/>
       </w:pPr>
-      <w:bookmarkStart w:id="19" w:name="_Toc243227955"/>
+      <w:bookmarkStart w:id="19" w:name="_Toc243238318"/>
       <w:r>
         <w:rPr>
           <w:rFonts w:ascii="Arial" w:eastAsia="Arial" w:hAnsi="Arial"/>
@@ -15594,7 +15593,7 @@
         </w:pBdr>
         <w:spacing w:before="240" w:after="40" w:line="252" w:lineRule="auto"/>
       </w:pPr>
-      <w:bookmarkStart w:id="20" w:name="_Toc243227956"/>
+      <w:bookmarkStart w:id="20" w:name="_Toc243238319"/>
       <w:r>
         <w:rPr>
           <w:rFonts w:ascii="Arial" w:eastAsia="Arial" w:hAnsi="Arial"/>
@@ -16821,7 +16820,7 @@
         <w:shd w:val="clear" w:color="auto" w:fill="0070C0"/>
         <w:spacing w:before="0" w:after="200" w:line="252" w:lineRule="auto"/>
       </w:pPr>
-      <w:bookmarkStart w:id="21" w:name="_Toc243227957"/>
+      <w:bookmarkStart w:id="21" w:name="_Toc243238320"/>
       <w:r>
         <w:rPr>
           <w:rFonts w:ascii="Arial" w:eastAsia="Arial" w:hAnsi="Arial"/>
@@ -16840,7 +16839,7 @@
         </w:pBdr>
         <w:spacing w:before="240" w:after="40" w:line="252" w:lineRule="auto"/>
       </w:pPr>
-      <w:bookmarkStart w:id="22" w:name="_Toc243227958"/>
+      <w:bookmarkStart w:id="22" w:name="_Toc243238321"/>
       <w:r>
         <w:rPr>
           <w:rFonts w:ascii="Arial" w:eastAsia="Arial" w:hAnsi="Arial"/>
@@ -16935,7 +16934,7 @@
         <w:pStyle w:val="Ttulo3"/>
         <w:spacing w:before="160" w:after="60" w:line="252" w:lineRule="auto"/>
       </w:pPr>
-      <w:bookmarkStart w:id="23" w:name="_Toc243227959"/>
+      <w:bookmarkStart w:id="23" w:name="_Toc243238322"/>
       <w:r>
         <w:rPr>
           <w:rFonts w:ascii="Arial" w:eastAsia="Arial" w:hAnsi="Arial"/>
@@ -17041,7 +17040,7 @@
         <w:pStyle w:val="Ttulo3"/>
         <w:spacing w:before="160" w:after="60" w:line="252" w:lineRule="auto"/>
       </w:pPr>
-      <w:bookmarkStart w:id="24" w:name="_Toc243227960"/>
+      <w:bookmarkStart w:id="24" w:name="_Toc243238323"/>
       <w:r>
         <w:rPr>
           <w:rFonts w:ascii="Arial" w:eastAsia="Arial" w:hAnsi="Arial"/>
@@ -17103,7 +17102,7 @@
         </w:pBdr>
         <w:spacing w:before="240" w:after="40" w:line="252" w:lineRule="auto"/>
       </w:pPr>
-      <w:bookmarkStart w:id="25" w:name="_Toc243227961"/>
+      <w:bookmarkStart w:id="25" w:name="_Toc243238324"/>
       <w:r>
         <w:rPr>
           <w:rFonts w:ascii="Arial" w:eastAsia="Arial" w:hAnsi="Arial"/>
@@ -17154,7 +17153,7 @@
         <w:pStyle w:val="Ttulo3"/>
         <w:spacing w:before="160" w:after="60" w:line="252" w:lineRule="auto"/>
       </w:pPr>
-      <w:bookmarkStart w:id="26" w:name="_Toc243227962"/>
+      <w:bookmarkStart w:id="26" w:name="_Toc243238325"/>
       <w:r>
         <w:rPr>
           <w:rFonts w:ascii="Arial" w:eastAsia="Arial" w:hAnsi="Arial"/>
@@ -17226,7 +17225,7 @@
         <w:pStyle w:val="Ttulo3"/>
         <w:spacing w:before="160" w:after="60" w:line="252" w:lineRule="auto"/>
       </w:pPr>
-      <w:bookmarkStart w:id="27" w:name="_Toc243227963"/>
+      <w:bookmarkStart w:id="27" w:name="_Toc243238326"/>
       <w:r>
         <w:rPr>
           <w:rFonts w:ascii="Arial" w:eastAsia="Arial" w:hAnsi="Arial"/>
@@ -17278,7 +17277,7 @@
         </w:rPr>
         <w:lastRenderedPageBreak/>
         <w:drawing>
-          <wp:inline distT="0" distB="0" distL="0" distR="0" wp14:anchorId="11EDC8B9" wp14:editId="6A3A295C">
+          <wp:inline distT="0" distB="0" distL="0" distR="0" wp14:anchorId="30130A88" wp14:editId="6587BFDF">
             <wp:extent cx="4500000" cy="3524336"/>
             <wp:effectExtent l="0" t="0" r="0" b="0"/>
             <wp:docPr id="2" name="Picture 2"/>
@@ -17489,7 +17488,7 @@
         </w:rPr>
         <w:lastRenderedPageBreak/>
         <w:drawing>
-          <wp:inline distT="0" distB="0" distL="0" distR="0" wp14:anchorId="5451AB8D" wp14:editId="5C2F2719">
+          <wp:inline distT="0" distB="0" distL="0" distR="0" wp14:anchorId="23D8BE42" wp14:editId="4D07A133">
             <wp:extent cx="5940000" cy="5018071"/>
             <wp:effectExtent l="0" t="0" r="0" b="0"/>
             <wp:docPr id="3" name="Picture 3"/>
@@ -17610,7 +17609,7 @@
         </w:rPr>
         <w:lastRenderedPageBreak/>
         <w:drawing>
-          <wp:inline distT="0" distB="0" distL="0" distR="0" wp14:anchorId="17FBD2FC" wp14:editId="32D9CC6A">
+          <wp:inline distT="0" distB="0" distL="0" distR="0" wp14:anchorId="38BFF659" wp14:editId="375A7F7C">
             <wp:extent cx="6120000" cy="3169504"/>
             <wp:effectExtent l="0" t="0" r="0" b="0"/>
             <wp:docPr id="4" name="Picture 4"/>
@@ -17698,7 +17697,7 @@
           <w:noProof/>
         </w:rPr>
         <w:drawing>
-          <wp:inline distT="0" distB="0" distL="0" distR="0" wp14:anchorId="6883C131" wp14:editId="219767F8">
+          <wp:inline distT="0" distB="0" distL="0" distR="0" wp14:anchorId="25D99902" wp14:editId="27CF96DA">
             <wp:extent cx="6120000" cy="3448703"/>
             <wp:effectExtent l="0" t="0" r="0" b="0"/>
             <wp:docPr id="5" name="Picture 5"/>
@@ -17764,7 +17763,7 @@
         </w:pBdr>
         <w:spacing w:before="240" w:after="40" w:line="252" w:lineRule="auto"/>
       </w:pPr>
-      <w:bookmarkStart w:id="28" w:name="_Toc243227964"/>
+      <w:bookmarkStart w:id="28" w:name="_Toc243238327"/>
       <w:r>
         <w:rPr>
           <w:rFonts w:ascii="Arial" w:eastAsia="Arial" w:hAnsi="Arial"/>
@@ -17862,7 +17861,7 @@
         <w:pStyle w:val="Ttulo3"/>
         <w:spacing w:before="160" w:after="60" w:line="252" w:lineRule="auto"/>
       </w:pPr>
-      <w:bookmarkStart w:id="29" w:name="_Toc243227965"/>
+      <w:bookmarkStart w:id="29" w:name="_Toc243238328"/>
       <w:r>
         <w:rPr>
           <w:rFonts w:ascii="Arial" w:eastAsia="Arial" w:hAnsi="Arial"/>
@@ -18138,7 +18137,7 @@
         <w:pStyle w:val="Ttulo3"/>
         <w:spacing w:before="160" w:after="60" w:line="252" w:lineRule="auto"/>
       </w:pPr>
-      <w:bookmarkStart w:id="30" w:name="_Toc243227966"/>
+      <w:bookmarkStart w:id="30" w:name="_Toc243238329"/>
       <w:r>
         <w:rPr>
           <w:rFonts w:ascii="Arial" w:eastAsia="Arial" w:hAnsi="Arial"/>
@@ -18292,7 +18291,7 @@
         <w:pStyle w:val="Ttulo3"/>
         <w:spacing w:before="160" w:after="60" w:line="252" w:lineRule="auto"/>
       </w:pPr>
-      <w:bookmarkStart w:id="31" w:name="_Toc243227967"/>
+      <w:bookmarkStart w:id="31" w:name="_Toc243238330"/>
       <w:r>
         <w:rPr>
           <w:rFonts w:ascii="Arial" w:eastAsia="Arial" w:hAnsi="Arial"/>
@@ -19868,7 +19867,7 @@
         </w:pBdr>
         <w:spacing w:before="240" w:after="40" w:line="252" w:lineRule="auto"/>
       </w:pPr>
-      <w:bookmarkStart w:id="32" w:name="_Toc243227968"/>
+      <w:bookmarkStart w:id="32" w:name="_Toc243238331"/>
       <w:r>
         <w:rPr>
           <w:rFonts w:ascii="Arial" w:eastAsia="Arial" w:hAnsi="Arial"/>
@@ -19911,7 +19910,7 @@
         <w:pStyle w:val="Ttulo3"/>
         <w:spacing w:before="160" w:after="60" w:line="252" w:lineRule="auto"/>
       </w:pPr>
-      <w:bookmarkStart w:id="33" w:name="_Toc243227969"/>
+      <w:bookmarkStart w:id="33" w:name="_Toc243238332"/>
       <w:r>
         <w:rPr>
           <w:rFonts w:ascii="Arial" w:eastAsia="Arial" w:hAnsi="Arial"/>
@@ -20099,7 +20098,7 @@
         <w:pStyle w:val="Ttulo3"/>
         <w:spacing w:before="160" w:after="60" w:line="252" w:lineRule="auto"/>
       </w:pPr>
-      <w:bookmarkStart w:id="34" w:name="_Toc243227970"/>
+      <w:bookmarkStart w:id="34" w:name="_Toc243238333"/>
       <w:r>
         <w:rPr>
           <w:rFonts w:ascii="Arial" w:eastAsia="Arial" w:hAnsi="Arial"/>
@@ -20265,7 +20264,7 @@
         <w:shd w:val="clear" w:color="auto" w:fill="0070C0"/>
         <w:spacing w:before="0" w:after="200" w:line="252" w:lineRule="auto"/>
       </w:pPr>
-      <w:bookmarkStart w:id="35" w:name="_Toc243227971"/>
+      <w:bookmarkStart w:id="35" w:name="_Toc243238334"/>
       <w:r>
         <w:rPr>
           <w:rFonts w:ascii="Arial" w:eastAsia="Arial" w:hAnsi="Arial"/>
@@ -20284,7 +20283,7 @@
         </w:pBdr>
         <w:spacing w:before="240" w:after="40" w:line="252" w:lineRule="auto"/>
       </w:pPr>
-      <w:bookmarkStart w:id="36" w:name="_Toc243227972"/>
+      <w:bookmarkStart w:id="36" w:name="_Toc243238335"/>
       <w:r>
         <w:rPr>
           <w:rFonts w:ascii="Arial" w:eastAsia="Arial" w:hAnsi="Arial"/>
@@ -20365,7 +20364,7 @@
           <w:noProof/>
         </w:rPr>
         <w:drawing>
-          <wp:inline distT="0" distB="0" distL="0" distR="0" wp14:anchorId="487C4F8A" wp14:editId="64042EAF">
+          <wp:inline distT="0" distB="0" distL="0" distR="0" wp14:anchorId="61DAFAB7" wp14:editId="28D1304C">
             <wp:extent cx="6120000" cy="4603784"/>
             <wp:effectExtent l="0" t="0" r="0" b="0"/>
             <wp:docPr id="6" name="Picture 6"/>
@@ -20432,7 +20431,13 @@
         <w:rPr>
           <w:color w:val="1A1A1A"/>
         </w:rPr>
-        <w:t xml:space="preserve"> SPA em React 18 + TypeScript, servida como arquivos estáticos. Contém as telas, a navegação com rotas protegidas por perfil, os formulários validados com Zod e os hooks de dados (TanStack Query), que concentram todas as chamadas ao backend.</w:t>
+        <w:t xml:space="preserve"> SPA em React 18 + TypeScript, servida como arquivos estáticos pela Vercel (https://prontuario-pro-pi.vercel.app). Contém as telas, a navegação com rotas protegidas por perfil, os formulários validados com Zod e os hooks de dados (TanStack Query), que conc</w:t>
+      </w:r>
+      <w:r>
+        <w:rPr>
+          <w:color w:val="1A1A1A"/>
+        </w:rPr>
+        <w:t>entram todas as chamadas ao backend.</w:t>
       </w:r>
     </w:p>
     <w:p>
@@ -20446,14 +20451,7 @@
           <w:b/>
           <w:color w:val="1A1A1A"/>
         </w:rPr>
-        <w:t>Camada de Apli</w:t>
-      </w:r>
-      <w:r>
-        <w:rPr>
-          <w:b/>
-          <w:color w:val="1A1A1A"/>
-        </w:rPr>
-        <w:t>cação (Backend — Supabase):</w:t>
+        <w:t>Camada de Aplicação (Backend — Supabase):</w:t>
       </w:r>
       <w:r>
         <w:rPr>
@@ -21635,7 +21633,7 @@
         </w:pBdr>
         <w:spacing w:before="240" w:after="40" w:line="252" w:lineRule="auto"/>
       </w:pPr>
-      <w:bookmarkStart w:id="37" w:name="_Toc243227973"/>
+      <w:bookmarkStart w:id="37" w:name="_Toc243238336"/>
       <w:r>
         <w:rPr>
           <w:rFonts w:ascii="Arial" w:eastAsia="Arial" w:hAnsi="Arial"/>
@@ -23204,7 +23202,7 @@
                 <w:color w:val="1A1A1A"/>
                 <w:sz w:val="17"/>
               </w:rPr>
-              <w:t>Protótipo</w:t>
+              <w:t>Hospedagem</w:t>
             </w:r>
           </w:p>
         </w:tc>
@@ -23235,7 +23233,7 @@
                 <w:color w:val="1A1A1A"/>
                 <w:sz w:val="17"/>
               </w:rPr>
-              <w:t>Figma</w:t>
+              <w:t>Vercel</w:t>
             </w:r>
           </w:p>
         </w:tc>
@@ -23266,7 +23264,14 @@
                 <w:color w:val="1A1A1A"/>
                 <w:sz w:val="17"/>
               </w:rPr>
-              <w:t>Design de interface e fluxos de usuário.</w:t>
+              <w:t xml:space="preserve">Publica o frontend a cada push na branch main; variáveis VITE_SUPABASE_* configuradas no projeto e rewrite de SPA </w:t>
+            </w:r>
+            <w:r>
+              <w:rPr>
+                <w:color w:val="1A1A1A"/>
+                <w:sz w:val="17"/>
+              </w:rPr>
+              <w:t>(vercel.json).</w:t>
             </w:r>
           </w:p>
         </w:tc>
@@ -23303,6 +23308,104 @@
                 <w:color w:val="1A1A1A"/>
                 <w:sz w:val="17"/>
               </w:rPr>
+              <w:t>Protótipo</w:t>
+            </w:r>
+          </w:p>
+        </w:tc>
+        <w:tc>
+          <w:tcPr>
+            <w:tcW w:w="3262" w:type="dxa"/>
+            <w:tcBorders>
+              <w:top w:val="single" w:sz="6" w:space="0" w:color="A9C4E6"/>
+              <w:left w:val="single" w:sz="6" w:space="0" w:color="A9C4E6"/>
+              <w:bottom w:val="single" w:sz="6" w:space="0" w:color="A9C4E6"/>
+              <w:right w:val="single" w:sz="6" w:space="0" w:color="A9C4E6"/>
+            </w:tcBorders>
+            <w:tcMar>
+              <w:top w:w="60" w:type="dxa"/>
+              <w:left w:w="90" w:type="dxa"/>
+              <w:bottom w:w="60" w:type="dxa"/>
+              <w:right w:w="90" w:type="dxa"/>
+            </w:tcMar>
+            <w:vAlign w:val="center"/>
+          </w:tcPr>
+          <w:p>
+            <w:pPr>
+              <w:spacing w:after="0" w:line="264" w:lineRule="auto"/>
+            </w:pPr>
+            <w:r>
+              <w:rPr>
+                <w:color w:val="1A1A1A"/>
+                <w:sz w:val="17"/>
+              </w:rPr>
+              <w:t>Figma</w:t>
+            </w:r>
+          </w:p>
+        </w:tc>
+        <w:tc>
+          <w:tcPr>
+            <w:tcW w:w="4596" w:type="dxa"/>
+            <w:tcBorders>
+              <w:top w:val="single" w:sz="6" w:space="0" w:color="A9C4E6"/>
+              <w:left w:val="single" w:sz="6" w:space="0" w:color="A9C4E6"/>
+              <w:bottom w:val="single" w:sz="6" w:space="0" w:color="A9C4E6"/>
+              <w:right w:val="single" w:sz="6" w:space="0" w:color="A9C4E6"/>
+            </w:tcBorders>
+            <w:tcMar>
+              <w:top w:w="60" w:type="dxa"/>
+              <w:left w:w="90" w:type="dxa"/>
+              <w:bottom w:w="60" w:type="dxa"/>
+              <w:right w:w="90" w:type="dxa"/>
+            </w:tcMar>
+            <w:vAlign w:val="center"/>
+          </w:tcPr>
+          <w:p>
+            <w:pPr>
+              <w:spacing w:after="0" w:line="264" w:lineRule="auto"/>
+            </w:pPr>
+            <w:r>
+              <w:rPr>
+                <w:color w:val="1A1A1A"/>
+                <w:sz w:val="17"/>
+              </w:rPr>
+              <w:t>Design de interface e fluxos de usuário.</w:t>
+            </w:r>
+          </w:p>
+        </w:tc>
+      </w:tr>
+      <w:tr>
+        <w:trPr>
+          <w:cantSplit/>
+          <w:jc w:val="center"/>
+        </w:trPr>
+        <w:tc>
+          <w:tcPr>
+            <w:tcW w:w="1779" w:type="dxa"/>
+            <w:tcBorders>
+              <w:top w:val="single" w:sz="6" w:space="0" w:color="A9C4E6"/>
+              <w:left w:val="single" w:sz="6" w:space="0" w:color="A9C4E6"/>
+              <w:bottom w:val="single" w:sz="6" w:space="0" w:color="A9C4E6"/>
+              <w:right w:val="single" w:sz="6" w:space="0" w:color="A9C4E6"/>
+            </w:tcBorders>
+            <w:shd w:val="clear" w:color="auto" w:fill="F4F8FD"/>
+            <w:tcMar>
+              <w:top w:w="60" w:type="dxa"/>
+              <w:left w:w="90" w:type="dxa"/>
+              <w:bottom w:w="60" w:type="dxa"/>
+              <w:right w:w="90" w:type="dxa"/>
+            </w:tcMar>
+            <w:vAlign w:val="center"/>
+          </w:tcPr>
+          <w:p>
+            <w:pPr>
+              <w:spacing w:after="0" w:line="264" w:lineRule="auto"/>
+            </w:pPr>
+            <w:r>
+              <w:rPr>
+                <w:b/>
+                <w:color w:val="1A1A1A"/>
+                <w:sz w:val="17"/>
+              </w:rPr>
               <w:t>Backup</w:t>
             </w:r>
           </w:p>
@@ -23316,6 +23419,7 @@
               <w:bottom w:val="single" w:sz="6" w:space="0" w:color="A9C4E6"/>
               <w:right w:val="single" w:sz="6" w:space="0" w:color="A9C4E6"/>
             </w:tcBorders>
+            <w:shd w:val="clear" w:color="auto" w:fill="F4F8FD"/>
             <w:tcMar>
               <w:top w:w="60" w:type="dxa"/>
               <w:left w:w="90" w:type="dxa"/>
@@ -23346,6 +23450,7 @@
               <w:bottom w:val="single" w:sz="6" w:space="0" w:color="A9C4E6"/>
               <w:right w:val="single" w:sz="6" w:space="0" w:color="A9C4E6"/>
             </w:tcBorders>
+            <w:shd w:val="clear" w:color="auto" w:fill="F4F8FD"/>
             <w:tcMar>
               <w:top w:w="60" w:type="dxa"/>
               <w:left w:w="90" w:type="dxa"/>
@@ -23382,20 +23487,14 @@
         </w:pBdr>
         <w:spacing w:before="240" w:after="40" w:line="252" w:lineRule="auto"/>
       </w:pPr>
-      <w:bookmarkStart w:id="38" w:name="_Toc243227974"/>
+      <w:bookmarkStart w:id="38" w:name="_Toc243238337"/>
       <w:r>
         <w:rPr>
           <w:rFonts w:ascii="Arial" w:eastAsia="Arial" w:hAnsi="Arial"/>
           <w:sz w:val="22"/>
         </w:rPr>
-        <w:t xml:space="preserve">22 </w:t>
-      </w:r>
-      <w:r>
-        <w:rPr>
-          <w:rFonts w:ascii="Arial" w:eastAsia="Arial" w:hAnsi="Arial"/>
-          <w:sz w:val="22"/>
-        </w:rPr>
-        <w:t>IMPLEMENTAÇÃO POR CAMADAS DO SISTEMA</w:t>
+        <w:lastRenderedPageBreak/>
+        <w:t>22 IMPLEMENTAÇÃO POR CAMADAS DO SISTEMA</w:t>
       </w:r>
       <w:bookmarkEnd w:id="38"/>
     </w:p>
@@ -23436,13 +23535,13 @@
         <w:rPr>
           <w:color w:val="1A1A1A"/>
         </w:rPr>
-        <w:t>O desenvolvimento do Prontuário-Pro é realizado com base em uma arquitetura web apoiada em um provedor de Backend-as-a-Service, separando responsabi</w:t>
+        <w:t>O desenvolvimento do Prontuário-Pro é realizado com base em uma arquitetura web apoiada em um provedor de Backend-as-a-Service, separando responsabilidades entre frontend, regras de acesso/negócio e persistência de dados. O sis</w:t>
       </w:r>
       <w:r>
         <w:rPr>
           <w:color w:val="1A1A1A"/>
         </w:rPr>
-        <w:t>lidades entre frontend, regras de acesso/negócio e persistência de dados. O sistema é estruturado em três camadas:</w:t>
+        <w:t>tema é estruturado em três camadas:</w:t>
       </w:r>
     </w:p>
     <w:p>
@@ -23476,20 +23575,19 @@
           <w:b/>
           <w:color w:val="1A1A1A"/>
         </w:rPr>
-        <w:lastRenderedPageBreak/>
         <w:t>Backend (Camada de Aplicação e Acesso):</w:t>
       </w:r>
       <w:r>
         <w:rPr>
           <w:color w:val="1A1A1A"/>
         </w:rPr>
-        <w:t xml:space="preserve"> impl</w:t>
+        <w:t xml:space="preserve"> implementado como Backend-as-a-Service (Supabase). Autenticação, autorização por pe</w:t>
       </w:r>
       <w:r>
         <w:rPr>
           <w:color w:val="1A1A1A"/>
         </w:rPr>
-        <w:t>ementado como Backend-as-a-Service (Supabase). Autenticação, autorização por perfil (RLS), funções RPC e triggers em PL/pgSQL substituem a lógica que, em uma arquitetura tradicional, ficaria em um servidor de aplicação próprio.</w:t>
+        <w:t>rfil (RLS), funções RPC e triggers em PL/pgSQL substituem a lógica que, em uma arquitetura tradicional, ficaria em um servidor de aplicação próprio.</w:t>
       </w:r>
     </w:p>
     <w:p>
@@ -23503,14 +23601,7 @@
           <w:b/>
           <w:color w:val="1A1A1A"/>
         </w:rPr>
-        <w:t>Banco de Dados (Camada de Da</w:t>
-      </w:r>
-      <w:r>
-        <w:rPr>
-          <w:b/>
-          <w:color w:val="1A1A1A"/>
-        </w:rPr>
-        <w:t>dos):</w:t>
+        <w:t>Banco de Dados (Camada de Dados):</w:t>
       </w:r>
       <w:r>
         <w:rPr>
@@ -23524,7 +23615,7 @@
         <w:pStyle w:val="Ttulo3"/>
         <w:spacing w:before="160" w:after="60" w:line="252" w:lineRule="auto"/>
       </w:pPr>
-      <w:bookmarkStart w:id="39" w:name="_Toc243227975"/>
+      <w:bookmarkStart w:id="39" w:name="_Toc243238338"/>
       <w:r>
         <w:rPr>
           <w:rFonts w:ascii="Arial" w:eastAsia="Arial" w:hAnsi="Arial"/>
@@ -23542,13 +23633,13 @@
         <w:rPr>
           <w:color w:val="1A1A1A"/>
         </w:rPr>
-        <w:t>O frontend traduz os protótipos do Figma em 20 páginas React. Na Fase 02, todas as telas abaixo passaram a operar com dados reais do backend; a única exceção é o Paine</w:t>
+        <w:t xml:space="preserve">O frontend traduz os protótipos do Figma em 20 páginas React. Na Fase 02, todas as telas abaixo passaram a operar com dados reais do backend; a única exceção é o Painel de </w:t>
       </w:r>
       <w:r>
         <w:rPr>
           <w:color w:val="1A1A1A"/>
         </w:rPr>
-        <w:t>l de IA, que mantém dados simulados até a integração do RF-009. A tabela indica, para cada tela, o que é lido e gravado no backend.</w:t>
+        <w:t>IA, que mantém dados simulados até a integração do RF-009. A tabela indica, para cada tela, o que é lido e gravado no backend.</w:t>
       </w:r>
     </w:p>
     <w:tbl>
@@ -24080,7 +24171,15 @@
                 <w:color w:val="1A1A1A"/>
                 <w:sz w:val="17"/>
               </w:rPr>
-              <w:t>Agenda (/medico/agenda)</w:t>
+              <w:t xml:space="preserve">Agenda </w:t>
+            </w:r>
+            <w:r>
+              <w:rPr>
+                <w:b/>
+                <w:color w:val="1A1A1A"/>
+                <w:sz w:val="17"/>
+              </w:rPr>
+              <w:t>(/medico/agenda)</w:t>
             </w:r>
           </w:p>
         </w:tc>
@@ -25480,6 +25579,7 @@
                 <w:color w:val="1A1A1A"/>
                 <w:sz w:val="17"/>
               </w:rPr>
+              <w:lastRenderedPageBreak/>
               <w:t>Meus acessos e Privacidade (/paciente/acessos, /privacidade)</w:t>
             </w:r>
           </w:p>
@@ -25793,7 +25893,6 @@
         <w:rPr>
           <w:color w:val="1A1A1A"/>
         </w:rPr>
-        <w:lastRenderedPageBreak/>
         <w:t xml:space="preserve">A interface prioriza navegação simples, poucas </w:t>
       </w:r>
       <w:r>
@@ -25841,7 +25940,7 @@
         <w:pStyle w:val="Ttulo3"/>
         <w:spacing w:before="160" w:after="60" w:line="252" w:lineRule="auto"/>
       </w:pPr>
-      <w:bookmarkStart w:id="40" w:name="_Toc243227976"/>
+      <w:bookmarkStart w:id="40" w:name="_Toc243238339"/>
       <w:r>
         <w:rPr>
           <w:rFonts w:ascii="Arial" w:eastAsia="Arial" w:hAnsi="Arial"/>
@@ -27450,6 +27549,7 @@
                 <w:color w:val="1A1A1A"/>
                 <w:sz w:val="17"/>
               </w:rPr>
+              <w:lastRenderedPageBreak/>
               <w:t>validar_prescricao</w:t>
             </w:r>
           </w:p>
@@ -27848,7 +27948,6 @@
                 <w:color w:val="1A1A1A"/>
                 <w:sz w:val="17"/>
               </w:rPr>
-              <w:lastRenderedPageBreak/>
               <w:t xml:space="preserve">solicitar_encerramento_conta / </w:t>
             </w:r>
             <w:r>
@@ -29665,6 +29764,7 @@
                 <w:color w:val="1A1A1A"/>
                 <w:sz w:val="17"/>
               </w:rPr>
+              <w:lastRenderedPageBreak/>
               <w:t>Notificações</w:t>
             </w:r>
           </w:p>
@@ -29930,7 +30030,6 @@
                 <w:color w:val="1A1A1A"/>
                 <w:sz w:val="17"/>
               </w:rPr>
-              <w:lastRenderedPageBreak/>
               <w:t>Autorização por perfil</w:t>
             </w:r>
           </w:p>
@@ -30090,7 +30189,7 @@
         <w:pStyle w:val="Ttulo3"/>
         <w:spacing w:before="160" w:after="60" w:line="252" w:lineRule="auto"/>
       </w:pPr>
-      <w:bookmarkStart w:id="41" w:name="_Toc243227977"/>
+      <w:bookmarkStart w:id="41" w:name="_Toc243238340"/>
       <w:r>
         <w:rPr>
           <w:rFonts w:ascii="Arial" w:eastAsia="Arial" w:hAnsi="Arial"/>
@@ -31097,6 +31196,7 @@
           <w:b/>
           <w:color w:val="0070C0"/>
         </w:rPr>
+        <w:lastRenderedPageBreak/>
         <w:t xml:space="preserve">Exemplo real de </w:t>
       </w:r>
       <w:r>
@@ -31243,7 +31343,6 @@
                 <w:color w:val="1F3B73"/>
                 <w:sz w:val="17"/>
               </w:rPr>
-              <w:lastRenderedPageBreak/>
               <w:t>if (error) throw error;   // ex.: "Horário indisponível..." (RN-0</w:t>
             </w:r>
             <w:r>
@@ -31362,7 +31461,7 @@
           <w:noProof/>
         </w:rPr>
         <w:drawing>
-          <wp:inline distT="0" distB="0" distL="0" distR="0" wp14:anchorId="0F7FC957" wp14:editId="345BD94F">
+          <wp:inline distT="0" distB="0" distL="0" distR="0" wp14:anchorId="7C36AA13" wp14:editId="58278C45">
             <wp:extent cx="6120000" cy="3466728"/>
             <wp:effectExtent l="0" t="0" r="0" b="0"/>
             <wp:docPr id="7" name="Picture 7"/>
@@ -31502,6 +31601,7 @@
         <w:rPr>
           <w:color w:val="1A1A1A"/>
         </w:rPr>
+        <w:lastRenderedPageBreak/>
         <w:t>Acessos a prontuário e docume</w:t>
       </w:r>
       <w:r>
@@ -31547,20 +31647,13 @@
         <w:rPr>
           <w:color w:val="1A1A1A"/>
         </w:rPr>
-        <w:t xml:space="preserve">A integração pode ser demonstrada com dois navegadores abertos — um logado como médico e outro como paciente: ao finalizar uma prescrição ou solicitar uma </w:t>
+        <w:t>A integração pode ser demonstrada no ambiente publicado (https://prontuario-pro-pi.vercel.app) com dois navegadores abertos — um logado como médico e outro</w:t>
       </w:r>
       <w:r>
         <w:rPr>
           <w:color w:val="1A1A1A"/>
         </w:rPr>
-        <w:t xml:space="preserve">consulta em um deles, a notificação aparece no outro sem recarregar a página; ao tentar agendar dois atendimentos no mesmo horário, o segundo é </w:t>
-      </w:r>
-      <w:r>
-        <w:rPr>
-          <w:color w:val="1A1A1A"/>
-        </w:rPr>
-        <w:lastRenderedPageBreak/>
-        <w:t xml:space="preserve">recusado pelo backend. No repositório, </w:t>
+        <w:t xml:space="preserve"> como paciente: ao finalizar uma prescrição ou solicitar uma consulta em um deles, a notificação aparece no outro sem recarregar a página; ao tentar agendar dois atendimentos no mesmo horário, o segundo é recusado pelo backend. No repositório, </w:t>
       </w:r>
       <w:r>
         <w:rPr>
@@ -31614,13 +31707,7 @@
         <w:rPr>
           <w:color w:val="1A1A1A"/>
         </w:rPr>
-        <w:t>O banco de</w:t>
-      </w:r>
-      <w:r>
-        <w:rPr>
-          <w:color w:val="1A1A1A"/>
-        </w:rPr>
-        <w:t xml:space="preserve"> dados relacional (PostgreSQL) contém as tabelas </w:t>
+        <w:t xml:space="preserve">O banco de dados relacional (PostgreSQL) contém as tabelas </w:t>
       </w:r>
       <w:r>
         <w:rPr>
@@ -31774,13 +31861,13 @@
         <w:rPr>
           <w:color w:val="1A1A1A"/>
         </w:rPr>
-        <w:t>, modeladas conforme o Modelo Entidade-Relacionamento da Parte</w:t>
+        <w:t>,</w:t>
       </w:r>
       <w:r>
         <w:rPr>
           <w:color w:val="1A1A1A"/>
         </w:rPr>
-        <w:t xml:space="preserve"> 04 (Figura 2).</w:t>
+        <w:t xml:space="preserve"> modeladas conforme o Modelo Entidade-Relacionamento da Parte 04 (Figura 2).</w:t>
       </w:r>
     </w:p>
     <w:p>
@@ -31791,7 +31878,7 @@
         </w:pBdr>
         <w:spacing w:before="240" w:after="40" w:line="252" w:lineRule="auto"/>
       </w:pPr>
-      <w:bookmarkStart w:id="42" w:name="_Toc243227978"/>
+      <w:bookmarkStart w:id="42" w:name="_Toc243238341"/>
       <w:r>
         <w:rPr>
           <w:rFonts w:ascii="Arial" w:eastAsia="Arial" w:hAnsi="Arial"/>
@@ -31838,7 +31925,13 @@
         <w:rPr>
           <w:color w:val="1A1A1A"/>
         </w:rPr>
-        <w:t>O código-fonte do sistema está versionado com Git, permitindo controle de versões e colaboração entre os integrantes da equipe.</w:t>
+        <w:t xml:space="preserve">O código-fonte do sistema está versionado com Git, permitindo </w:t>
+      </w:r>
+      <w:r>
+        <w:rPr>
+          <w:color w:val="1A1A1A"/>
+        </w:rPr>
+        <w:t>controle de versões e colaboração entre os integrantes da equipe.</w:t>
       </w:r>
     </w:p>
     <w:p>
@@ -31943,28 +32036,28 @@
                 <w:color w:val="1F3B73"/>
                 <w:sz w:val="17"/>
               </w:rPr>
-              <w:t>│   ├── components/     layouts, rotas protegidas e componentes shadcn/ui</w:t>
-            </w:r>
-          </w:p>
-          <w:p>
-            <w:pPr>
-              <w:spacing w:after="0" w:line="240" w:lineRule="auto"/>
-            </w:pPr>
+              <w:t xml:space="preserve">│   ├── components/     </w:t>
+            </w:r>
             <w:r>
               <w:rPr>
                 <w:rFonts w:ascii="Consolas" w:eastAsia="Consolas" w:hAnsi="Consolas"/>
                 <w:color w:val="1F3B73"/>
                 <w:sz w:val="17"/>
               </w:rPr>
-              <w:t xml:space="preserve">│   ├── hooks/    </w:t>
-            </w:r>
+              <w:t>layouts, rotas protegidas e componentes shadcn/ui</w:t>
+            </w:r>
+          </w:p>
+          <w:p>
+            <w:pPr>
+              <w:spacing w:after="0" w:line="240" w:lineRule="auto"/>
+            </w:pPr>
             <w:r>
               <w:rPr>
                 <w:rFonts w:ascii="Consolas" w:eastAsia="Consolas" w:hAnsi="Consolas"/>
                 <w:color w:val="1F3B73"/>
                 <w:sz w:val="17"/>
               </w:rPr>
-              <w:t xml:space="preserve">      hooks de dados (TanStack Query) — camada de acesso ao backend</w:t>
+              <w:t>│   ├── hooks/          hooks de dados (TanStack Query) — camada de acesso ao backend</w:t>
             </w:r>
           </w:p>
           <w:p>
@@ -31990,28 +32083,28 @@
                 <w:color w:val="1F3B73"/>
                 <w:sz w:val="17"/>
               </w:rPr>
-              <w:t>│   ├── lib/            cliente supabase, tipos do banco, máscaras, validações, CSV</w:t>
-            </w:r>
-          </w:p>
-          <w:p>
-            <w:pPr>
-              <w:spacing w:after="0" w:line="240" w:lineRule="auto"/>
-            </w:pPr>
+              <w:t xml:space="preserve">│   ├── lib/            cliente supabase, tipos </w:t>
+            </w:r>
             <w:r>
               <w:rPr>
                 <w:rFonts w:ascii="Consolas" w:eastAsia="Consolas" w:hAnsi="Consolas"/>
                 <w:color w:val="1F3B73"/>
                 <w:sz w:val="17"/>
               </w:rPr>
-              <w:t>│   └── test/           testes a</w:t>
-            </w:r>
+              <w:t>do banco, máscaras, validações, CSV</w:t>
+            </w:r>
+          </w:p>
+          <w:p>
+            <w:pPr>
+              <w:spacing w:after="0" w:line="240" w:lineRule="auto"/>
+            </w:pPr>
             <w:r>
               <w:rPr>
                 <w:rFonts w:ascii="Consolas" w:eastAsia="Consolas" w:hAnsi="Consolas"/>
                 <w:color w:val="1F3B73"/>
                 <w:sz w:val="17"/>
               </w:rPr>
-              <w:t>utomatizados (Vitest)</w:t>
+              <w:t>│   └── test/           testes automatizados (Vitest)</w:t>
             </w:r>
           </w:p>
           <w:p>
@@ -32024,7 +32117,7 @@
                 <w:color w:val="1F3B73"/>
                 <w:sz w:val="17"/>
               </w:rPr>
-              <w:t>└── supabase/</w:t>
+              <w:t>├── supabase/</w:t>
             </w:r>
           </w:p>
           <w:p>
@@ -32037,7 +32130,28 @@
                 <w:color w:val="1F3B73"/>
                 <w:sz w:val="17"/>
               </w:rPr>
-              <w:t xml:space="preserve">    └── migrations/     001 a 018 — tabelas, RLS, funções, triggers e Storage</w:t>
+              <w:t>│   └── migrations/     001 a 018 — tabelas, RLS, funções, triggers e Storage</w:t>
+            </w:r>
+          </w:p>
+          <w:p>
+            <w:pPr>
+              <w:spacing w:after="0" w:line="240" w:lineRule="auto"/>
+            </w:pPr>
+            <w:r>
+              <w:rPr>
+                <w:rFonts w:ascii="Consolas" w:eastAsia="Consolas" w:hAnsi="Consolas"/>
+                <w:color w:val="1F3B73"/>
+                <w:sz w:val="17"/>
+              </w:rPr>
+              <w:t>└── vercel.json        configuração do deploy (build Vite + rewrite de SPA</w:t>
+            </w:r>
+            <w:r>
+              <w:rPr>
+                <w:rFonts w:ascii="Consolas" w:eastAsia="Consolas" w:hAnsi="Consolas"/>
+                <w:color w:val="1F3B73"/>
+                <w:sz w:val="17"/>
+              </w:rPr>
+              <w:t>)</w:t>
             </w:r>
           </w:p>
         </w:tc>
@@ -32057,13 +32171,7 @@
         <w:rPr>
           <w:color w:val="1A1A1A"/>
         </w:rPr>
-        <w:t xml:space="preserve">Nesta etapa o foco foi a integração entre as camadas e a coerência entre código e documentação. Nas próximas fases, o sistema será </w:t>
-      </w:r>
-      <w:r>
-        <w:rPr>
-          <w:color w:val="1A1A1A"/>
-        </w:rPr>
-        <w:t>evoluído com:</w:t>
+        <w:t>Nesta etapa o foco foi a integração entre as camadas e a coerência entre código e documentação. Nas próximas fases, o sistema será evoluído com:</w:t>
       </w:r>
     </w:p>
     <w:p>
@@ -32076,7 +32184,7 @@
         <w:rPr>
           <w:color w:val="1A1A1A"/>
         </w:rPr>
-        <w:t>publicação do ambiente de demonstração (deploy);</w:t>
+        <w:t>integração do painel de IA com um serviço real (RF-009);</w:t>
       </w:r>
     </w:p>
     <w:p>
@@ -32089,20 +32197,13 @@
         <w:rPr>
           <w:color w:val="1A1A1A"/>
         </w:rPr>
-        <w:t>integração do painel de IA com um serviço real (RF-009);</w:t>
-      </w:r>
-    </w:p>
-    <w:p>
-      <w:pPr>
-        <w:pStyle w:val="Commarcadores"/>
-        <w:spacing w:after="40" w:line="288" w:lineRule="auto"/>
-        <w:jc w:val="both"/>
-      </w:pPr>
+        <w:t xml:space="preserve">envio eletrônico de prescrições (RF-007) e </w:t>
+      </w:r>
       <w:r>
         <w:rPr>
           <w:color w:val="1A1A1A"/>
         </w:rPr>
-        <w:t>envio eletrônico de prescrições (RF-007) e perfis de funcionários (RF-008);</w:t>
+        <w:t>perfis de funcionários (RF-008);</w:t>
       </w:r>
     </w:p>
     <w:p>
@@ -32115,13 +32216,7 @@
         <w:rPr>
           <w:color w:val="1A1A1A"/>
         </w:rPr>
-        <w:t xml:space="preserve">medição de desempenho (RNF-004) e ampliação da cobertura de </w:t>
-      </w:r>
-      <w:r>
-        <w:rPr>
-          <w:color w:val="1A1A1A"/>
-        </w:rPr>
-        <w:t>testes.</w:t>
+        <w:t>medição de desempenho (RNF-004) e ampliação da cobertura de testes.</w:t>
       </w:r>
     </w:p>
     <w:p>
@@ -32138,7 +32233,7 @@
         <w:shd w:val="clear" w:color="auto" w:fill="0070C0"/>
         <w:spacing w:before="0" w:after="200" w:line="252" w:lineRule="auto"/>
       </w:pPr>
-      <w:bookmarkStart w:id="43" w:name="_Toc243227979"/>
+      <w:bookmarkStart w:id="43" w:name="_Toc243238342"/>
       <w:r>
         <w:rPr>
           <w:rFonts w:ascii="Arial" w:eastAsia="Arial" w:hAnsi="Arial"/>
@@ -32158,13 +32253,13 @@
         <w:rPr>
           <w:color w:val="1A1A1A"/>
         </w:rPr>
-        <w:t>Esta parte do documento representa a etapa final de amadurecimento do Projeto Integrador. Ela é dividida em dois momentos distintos: no 7º período, o foco está na qualidade técni</w:t>
+        <w:t>Esta parte do documento representa a etapa final de amadurecimento do Projeto Integra</w:t>
       </w:r>
       <w:r>
         <w:rPr>
           <w:color w:val="1A1A1A"/>
         </w:rPr>
-        <w:t>ca do sistema em funcionamento; no 8º período, o foco passa a ser a avaliação global do projeto e a apresentação de extensões ou complementos, quando existirem.</w:t>
+        <w:t>dor. Ela é dividida em dois momentos distintos: no 7º período, o foco está na qualidade técnica do sistema em funcionamento; no 8º período, o foco passa a ser a avaliação global do projeto e a apresentação de extensões ou complementos, quando existirem.</w:t>
       </w:r>
     </w:p>
     <w:p>
@@ -32175,13 +32270,20 @@
         </w:pBdr>
         <w:spacing w:before="240" w:after="40" w:line="252" w:lineRule="auto"/>
       </w:pPr>
-      <w:bookmarkStart w:id="44" w:name="_Toc243227980"/>
+      <w:bookmarkStart w:id="44" w:name="_Toc243238343"/>
       <w:r>
         <w:rPr>
           <w:rFonts w:ascii="Arial" w:eastAsia="Arial" w:hAnsi="Arial"/>
           <w:sz w:val="22"/>
         </w:rPr>
-        <w:t>24 QUALIDADE DO SOFTWARE E TESTES</w:t>
+        <w:t>24</w:t>
+      </w:r>
+      <w:r>
+        <w:rPr>
+          <w:rFonts w:ascii="Arial" w:eastAsia="Arial" w:hAnsi="Arial"/>
+          <w:sz w:val="22"/>
+        </w:rPr>
+        <w:t xml:space="preserve"> QUALIDADE DO SOFTWARE E TESTES</w:t>
       </w:r>
       <w:bookmarkEnd w:id="44"/>
     </w:p>
@@ -32234,7 +32336,7 @@
         </w:pBdr>
         <w:spacing w:before="240" w:after="40" w:line="252" w:lineRule="auto"/>
       </w:pPr>
-      <w:bookmarkStart w:id="45" w:name="_Toc243227981"/>
+      <w:bookmarkStart w:id="45" w:name="_Toc243238344"/>
       <w:r>
         <w:rPr>
           <w:rFonts w:ascii="Arial" w:eastAsia="Arial" w:hAnsi="Arial"/>
@@ -32255,7 +32357,15 @@
           <w:color w:val="6B6B6B"/>
           <w:sz w:val="16"/>
         </w:rPr>
-        <w:t>Criação obrigatória: 7º Período – Fase 02</w:t>
+        <w:t xml:space="preserve">Criação </w:t>
+      </w:r>
+      <w:r>
+        <w:rPr>
+          <w:i/>
+          <w:color w:val="6B6B6B"/>
+          <w:sz w:val="16"/>
+        </w:rPr>
+        <w:t>obrigatória: 7º Período – Fase 02</w:t>
       </w:r>
     </w:p>
     <w:p>
@@ -32282,14 +32392,7 @@
           <w:i/>
           <w:color w:val="1A1A1A"/>
         </w:rPr>
-        <w:t xml:space="preserve">Seção prevista para </w:t>
-      </w:r>
-      <w:r>
-        <w:rPr>
-          <w:i/>
-          <w:color w:val="1A1A1A"/>
-        </w:rPr>
-        <w:t>desenvolvimento no 7º período – Fase 02. Não aplicável à entrega atual do 6º período – Fase 02.</w:t>
+        <w:t>Seção prevista para desenvolvimento no 7º período – Fase 02. Não aplicável à entrega atual do 6º período – Fase 02.</w:t>
       </w:r>
     </w:p>
     <w:p>
@@ -32300,7 +32403,7 @@
         </w:pBdr>
         <w:spacing w:before="240" w:after="40" w:line="252" w:lineRule="auto"/>
       </w:pPr>
-      <w:bookmarkStart w:id="46" w:name="_Toc243227982"/>
+      <w:bookmarkStart w:id="46" w:name="_Toc243238345"/>
       <w:r>
         <w:rPr>
           <w:rFonts w:ascii="Arial" w:eastAsia="Arial" w:hAnsi="Arial"/>
@@ -32321,7 +32424,15 @@
           <w:color w:val="6B6B6B"/>
           <w:sz w:val="16"/>
         </w:rPr>
-        <w:t>Criação obrigatória: 8º Período – Fase 01</w:t>
+        <w:t>Criação obrigatória: 8º Período – Fase 0</w:t>
+      </w:r>
+      <w:r>
+        <w:rPr>
+          <w:i/>
+          <w:color w:val="6B6B6B"/>
+          <w:sz w:val="16"/>
+        </w:rPr>
+        <w:t>1</w:t>
       </w:r>
     </w:p>
     <w:p>
@@ -32334,14 +32445,7 @@
           <w:i/>
           <w:color w:val="1A1A1A"/>
         </w:rPr>
-        <w:t>Seção prevista para desenvolvimento no 8º período – Fase 01. Não aplicável à</w:t>
-      </w:r>
-      <w:r>
-        <w:rPr>
-          <w:i/>
-          <w:color w:val="1A1A1A"/>
-        </w:rPr>
-        <w:t xml:space="preserve"> entrega atual do 6º período – Fase 02.</w:t>
+        <w:t>Seção prevista para desenvolvimento no 8º período – Fase 01. Não aplicável à entrega atual do 6º período – Fase 02.</w:t>
       </w:r>
     </w:p>
     <w:p>
@@ -32352,7 +32456,7 @@
         </w:pBdr>
         <w:spacing w:before="240" w:after="40" w:line="252" w:lineRule="auto"/>
       </w:pPr>
-      <w:bookmarkStart w:id="47" w:name="_Toc243227983"/>
+      <w:bookmarkStart w:id="47" w:name="_Toc243238346"/>
       <w:r>
         <w:rPr>
           <w:rFonts w:ascii="Arial" w:eastAsia="Arial" w:hAnsi="Arial"/>
@@ -32386,7 +32490,14 @@
           <w:i/>
           <w:color w:val="1A1A1A"/>
         </w:rPr>
-        <w:t>Seção prevista para desenvolvimento no 8º período – Fase 02. Não aplicável à entrega atual do 6º período – Fase 02.</w:t>
+        <w:t>Seção prevista para desenvolvimento no 8º período – Fas</w:t>
+      </w:r>
+      <w:r>
+        <w:rPr>
+          <w:i/>
+          <w:color w:val="1A1A1A"/>
+        </w:rPr>
+        <w:t>e 02. Não aplicável à entrega atual do 6º período – Fase 02.</w:t>
       </w:r>
     </w:p>
     <w:sectPr>
@@ -32438,7 +32549,7 @@
         <w:noProof/>
       </w:rPr>
       <w:drawing>
-        <wp:inline distT="0" distB="0" distL="0" distR="0" wp14:anchorId="06AFA975" wp14:editId="1C0493CB">
+        <wp:inline distT="0" distB="0" distL="0" distR="0" wp14:anchorId="6A905C32" wp14:editId="3F2DE01A">
           <wp:extent cx="7560000" cy="756000"/>
           <wp:effectExtent l="0" t="0" r="0" b="0"/>
           <wp:docPr id="11" name="Picture 1"/>
@@ -32514,7 +32625,7 @@
         <w:noProof/>
       </w:rPr>
       <w:drawing>
-        <wp:inline distT="0" distB="0" distL="0" distR="0" wp14:anchorId="5A034A32" wp14:editId="4B424265">
+        <wp:inline distT="0" distB="0" distL="0" distR="0" wp14:anchorId="6E4B38C6" wp14:editId="56CDF5D2">
           <wp:extent cx="7560000" cy="270000"/>
           <wp:effectExtent l="0" t="0" r="0" b="0"/>
           <wp:docPr id="8" name="Picture 1"/>
@@ -32578,7 +32689,7 @@
               <w:noProof/>
             </w:rPr>
             <w:drawing>
-              <wp:inline distT="0" distB="0" distL="0" distR="0" wp14:anchorId="47F9FB8D" wp14:editId="5C342869">
+              <wp:inline distT="0" distB="0" distL="0" distR="0" wp14:anchorId="365C651D" wp14:editId="119FCBA0">
                 <wp:extent cx="1908000" cy="325227"/>
                 <wp:effectExtent l="0" t="0" r="0" b="0"/>
                 <wp:docPr id="9" name="Picture 2"/>
@@ -32630,7 +32741,7 @@
               <w:noProof/>
             </w:rPr>
             <w:drawing>
-              <wp:inline distT="0" distB="0" distL="0" distR="0" wp14:anchorId="57FF3C54" wp14:editId="75BA49D7">
+              <wp:inline distT="0" distB="0" distL="0" distR="0" wp14:anchorId="3A53748B" wp14:editId="2EAAD3E9">
                 <wp:extent cx="1296000" cy="481500"/>
                 <wp:effectExtent l="0" t="0" r="0" b="0"/>
                 <wp:docPr id="10" name="Picture 3"/>
@@ -44303,7 +44414,7 @@
     <w:autoRedefine/>
     <w:uiPriority w:val="39"/>
     <w:unhideWhenUsed/>
-    <w:rsid w:val="006D158D"/>
+    <w:rsid w:val="00C33A7D"/>
     <w:pPr>
       <w:spacing w:after="100"/>
     </w:pPr>
@@ -44315,7 +44426,7 @@
     <w:autoRedefine/>
     <w:uiPriority w:val="39"/>
     <w:unhideWhenUsed/>
-    <w:rsid w:val="006D158D"/>
+    <w:rsid w:val="00C33A7D"/>
     <w:pPr>
       <w:spacing w:after="100"/>
       <w:ind w:left="200"/>
@@ -44328,7 +44439,7 @@
     <w:autoRedefine/>
     <w:uiPriority w:val="39"/>
     <w:unhideWhenUsed/>
-    <w:rsid w:val="006D158D"/>
+    <w:rsid w:val="00C33A7D"/>
     <w:pPr>
       <w:spacing w:after="100"/>
       <w:ind w:left="400"/>
@@ -44339,7 +44450,7 @@
     <w:basedOn w:val="Fontepargpadro"/>
     <w:uiPriority w:val="99"/>
     <w:unhideWhenUsed/>
-    <w:rsid w:val="006D158D"/>
+    <w:rsid w:val="00C33A7D"/>
     <w:rPr>
       <w:color w:val="0000FF" w:themeColor="hyperlink"/>
       <w:u w:val="single"/>

</xml_diff>